<commit_message>
Practical 1: add sitemap and wireframe PDFs, deliverables list, source code evidence
Co-Authored-By: Claude Opus 5.5 <noreply@anthropic.com>
</commit_message>
<xml_diff>
--- a/Practical-1/PRAC_1_ITUE203_25CS023.docx
+++ b/Practical-1/PRAC_1_ITUE203_25CS023.docx
@@ -3674,7 +3674,63 @@
           <w:sz w:val="18"/>
           <w:szCs w:val="18"/>
         </w:rPr>
-        <w:t xml:space="preserve">└── source/build_diagrams.py   (regenerates the diagrams)</w:t>
+        <w:t xml:space="preserve">├── PRAC_1_Sitemap_25CS023.pdf       (sitemap, 1 page)</w:t>
+      </w:r>
+    </w:p>
+    <w:p>
+      <w:pPr>
+        <w:pStyle w:val="Code"/>
+        <w:spacing w:before="0" w:after="0"/>
+      </w:pPr>
+      <w:r>
+        <w:rPr>
+          <w:rFonts w:ascii="Consolas" w:hAnsi="Consolas" w:cs="Consolas"/>
+          <w:sz w:val="18"/>
+          <w:szCs w:val="18"/>
+        </w:rPr>
+        <w:t xml:space="preserve">├── PRAC_1_Wireframes_25CS023.pdf    (wireframes, 3 pages)</w:t>
+      </w:r>
+    </w:p>
+    <w:p>
+      <w:pPr>
+        <w:pStyle w:val="Code"/>
+        <w:spacing w:before="0" w:after="0"/>
+      </w:pPr>
+      <w:r>
+        <w:rPr>
+          <w:rFonts w:ascii="Consolas" w:hAnsi="Consolas" w:cs="Consolas"/>
+          <w:sz w:val="18"/>
+          <w:szCs w:val="18"/>
+        </w:rPr>
+        <w:t xml:space="preserve">├── PRAC_1_ITUE203_25CS023.docx      (this report)</w:t>
+      </w:r>
+    </w:p>
+    <w:p>
+      <w:pPr>
+        <w:pStyle w:val="Code"/>
+        <w:spacing w:before="0" w:after="0"/>
+      </w:pPr>
+      <w:r>
+        <w:rPr>
+          <w:rFonts w:ascii="Consolas" w:hAnsi="Consolas" w:cs="Consolas"/>
+          <w:sz w:val="18"/>
+          <w:szCs w:val="18"/>
+        </w:rPr>
+        <w:t xml:space="preserve">├── screenshots/                     (GitHub repository screenshot)</w:t>
+      </w:r>
+    </w:p>
+    <w:p>
+      <w:pPr>
+        <w:pStyle w:val="Code"/>
+        <w:spacing w:before="0" w:after="0"/>
+      </w:pPr>
+      <w:r>
+        <w:rPr>
+          <w:rFonts w:ascii="Consolas" w:hAnsi="Consolas" w:cs="Consolas"/>
+          <w:sz w:val="18"/>
+          <w:szCs w:val="18"/>
+        </w:rPr>
+        <w:t xml:space="preserve">└── source/build_diagrams.py, export_pdfs.py</w:t>
       </w:r>
     </w:p>
     <w:p>
@@ -3706,7 +3762,1899 @@
         <w:keepNext/>
       </w:pPr>
       <w:r>
-        <w:t xml:space="preserve">11. GitHub Repository</w:t>
+        <w:t xml:space="preserve">11. Source Code Evidence</w:t>
+      </w:r>
+    </w:p>
+    <w:p>
+      <w:pPr/>
+      <w:r>
+        <w:t xml:space="preserve">The excerpts below are copied unchanged from the StudentHub application in the repository (studenthub/ folder; Practical-15 holds an identical copy). Line numbers match the files; only the common leading indentation is removed. They show how the planned page structure and navigation flow are implemented.</w:t>
+      </w:r>
+    </w:p>
+    <w:tbl>
+      <w:tblPr>
+        <w:tblW w:w="9638" w:type="dxa"/>
+        <w:tblBorders>
+          <w:top w:val="single" w:sz="4" w:space="0" w:color="B8BECC"/>
+          <w:left w:val="single" w:sz="4" w:space="0" w:color="B8BECC"/>
+          <w:bottom w:val="single" w:sz="4" w:space="0" w:color="B8BECC"/>
+          <w:right w:val="single" w:sz="4" w:space="0" w:color="B8BECC"/>
+          <w:insideH w:val="single" w:sz="4" w:space="0" w:color="B8BECC"/>
+          <w:insideV w:val="single" w:sz="4" w:space="0" w:color="B8BECC"/>
+        </w:tblBorders>
+        <w:tblLayout w:type="fixed"/>
+        <w:tblCellMar>
+          <w:top w:w="60" w:type="dxa"/>
+          <w:left w:w="100" w:type="dxa"/>
+          <w:bottom w:w="60" w:type="dxa"/>
+          <w:right w:w="100" w:type="dxa"/>
+        </w:tblCellMar>
+      </w:tblPr>
+      <w:tblGrid>
+        <w:gridCol w:w="3000"/>
+        <w:gridCol w:w="1300"/>
+        <w:gridCol w:w="5338"/>
+      </w:tblGrid>
+      <w:tr>
+        <w:trPr>
+          <w:tblHeader/>
+          <w:cantSplit/>
+        </w:trPr>
+        <w:tc>
+          <w:tcPr>
+            <w:tcW w:w="3000" w:type="dxa"/>
+            <w:shd w:val="clear" w:color="auto" w:fill="1F2A5C"/>
+          </w:tcPr>
+          <w:p>
+            <w:pPr>
+              <w:spacing w:before="0" w:after="0"/>
+              <w:jc w:val="left"/>
+            </w:pPr>
+            <w:r>
+              <w:rPr>
+                <w:b/>
+                <w:color w:val="FFFFFF"/>
+                <w:sz w:val="20"/>
+                <w:szCs w:val="20"/>
+              </w:rPr>
+              <w:t xml:space="preserve">File</w:t>
+            </w:r>
+          </w:p>
+        </w:tc>
+        <w:tc>
+          <w:tcPr>
+            <w:tcW w:w="1300" w:type="dxa"/>
+            <w:shd w:val="clear" w:color="auto" w:fill="1F2A5C"/>
+          </w:tcPr>
+          <w:p>
+            <w:pPr>
+              <w:spacing w:before="0" w:after="0"/>
+              <w:jc w:val="left"/>
+            </w:pPr>
+            <w:r>
+              <w:rPr>
+                <w:b/>
+                <w:color w:val="FFFFFF"/>
+                <w:sz w:val="20"/>
+                <w:szCs w:val="20"/>
+              </w:rPr>
+              <w:t xml:space="preserve">Lines</w:t>
+            </w:r>
+          </w:p>
+        </w:tc>
+        <w:tc>
+          <w:tcPr>
+            <w:tcW w:w="5338" w:type="dxa"/>
+            <w:shd w:val="clear" w:color="auto" w:fill="1F2A5C"/>
+          </w:tcPr>
+          <w:p>
+            <w:pPr>
+              <w:spacing w:before="0" w:after="0"/>
+              <w:jc w:val="left"/>
+            </w:pPr>
+            <w:r>
+              <w:rPr>
+                <w:b/>
+                <w:color w:val="FFFFFF"/>
+                <w:sz w:val="20"/>
+                <w:szCs w:val="20"/>
+              </w:rPr>
+              <w:t xml:space="preserve">Shows</w:t>
+            </w:r>
+          </w:p>
+        </w:tc>
+      </w:tr>
+      <w:tr>
+        <w:trPr>
+          <w:cantSplit/>
+        </w:trPr>
+        <w:tc>
+          <w:tcPr>
+            <w:tcW w:w="3000" w:type="dxa"/>
+          </w:tcPr>
+          <w:p>
+            <w:pPr>
+              <w:spacing w:before="0" w:after="0"/>
+              <w:jc w:val="left"/>
+            </w:pPr>
+            <w:r>
+              <w:rPr>
+                <w:sz w:val="20"/>
+                <w:szCs w:val="20"/>
+              </w:rPr>
+              <w:t xml:space="preserve">studenthub/index.php</w:t>
+            </w:r>
+          </w:p>
+        </w:tc>
+        <w:tc>
+          <w:tcPr>
+            <w:tcW w:w="1300" w:type="dxa"/>
+          </w:tcPr>
+          <w:p>
+            <w:pPr>
+              <w:spacing w:before="0" w:after="0"/>
+              <w:jc w:val="left"/>
+            </w:pPr>
+            <w:r>
+              <w:rPr>
+                <w:sz w:val="20"/>
+                <w:szCs w:val="20"/>
+              </w:rPr>
+              <w:t xml:space="preserve">18–27</w:t>
+            </w:r>
+          </w:p>
+        </w:tc>
+        <w:tc>
+          <w:tcPr>
+            <w:tcW w:w="5338" w:type="dxa"/>
+          </w:tcPr>
+          <w:p>
+            <w:pPr>
+              <w:spacing w:before="0" w:after="0"/>
+              <w:jc w:val="left"/>
+            </w:pPr>
+            <w:r>
+              <w:rPr>
+                <w:sz w:val="20"/>
+                <w:szCs w:val="20"/>
+              </w:rPr>
+              <w:t xml:space="preserve">Document structure and metadata of the home page</w:t>
+            </w:r>
+          </w:p>
+        </w:tc>
+      </w:tr>
+      <w:tr>
+        <w:trPr>
+          <w:cantSplit/>
+        </w:trPr>
+        <w:tc>
+          <w:tcPr>
+            <w:tcW w:w="3000" w:type="dxa"/>
+          </w:tcPr>
+          <w:p>
+            <w:pPr>
+              <w:spacing w:before="0" w:after="0"/>
+              <w:jc w:val="left"/>
+            </w:pPr>
+            <w:r>
+              <w:rPr>
+                <w:sz w:val="20"/>
+                <w:szCs w:val="20"/>
+              </w:rPr>
+              <w:t xml:space="preserve">studenthub/index.php</w:t>
+            </w:r>
+          </w:p>
+        </w:tc>
+        <w:tc>
+          <w:tcPr>
+            <w:tcW w:w="1300" w:type="dxa"/>
+          </w:tcPr>
+          <w:p>
+            <w:pPr>
+              <w:spacing w:before="0" w:after="0"/>
+              <w:jc w:val="left"/>
+            </w:pPr>
+            <w:r>
+              <w:rPr>
+                <w:sz w:val="20"/>
+                <w:szCs w:val="20"/>
+              </w:rPr>
+              <w:t xml:space="preserve">36–65</w:t>
+            </w:r>
+          </w:p>
+        </w:tc>
+        <w:tc>
+          <w:tcPr>
+            <w:tcW w:w="5338" w:type="dxa"/>
+          </w:tcPr>
+          <w:p>
+            <w:pPr>
+              <w:spacing w:before="0" w:after="0"/>
+              <w:jc w:val="left"/>
+            </w:pPr>
+            <w:r>
+              <w:rPr>
+                <w:sz w:val="20"/>
+                <w:szCs w:val="20"/>
+              </w:rPr>
+              <w:t xml:space="preserve">Header, brand, theme toggle, hamburger button and main navigation</w:t>
+            </w:r>
+          </w:p>
+        </w:tc>
+      </w:tr>
+      <w:tr>
+        <w:trPr>
+          <w:cantSplit/>
+        </w:trPr>
+        <w:tc>
+          <w:tcPr>
+            <w:tcW w:w="3000" w:type="dxa"/>
+          </w:tcPr>
+          <w:p>
+            <w:pPr>
+              <w:spacing w:before="0" w:after="0"/>
+              <w:jc w:val="left"/>
+            </w:pPr>
+            <w:r>
+              <w:rPr>
+                <w:sz w:val="20"/>
+                <w:szCs w:val="20"/>
+              </w:rPr>
+              <w:t xml:space="preserve">studenthub/sidebar.php</w:t>
+            </w:r>
+          </w:p>
+        </w:tc>
+        <w:tc>
+          <w:tcPr>
+            <w:tcW w:w="1300" w:type="dxa"/>
+          </w:tcPr>
+          <w:p>
+            <w:pPr>
+              <w:spacing w:before="0" w:after="0"/>
+              <w:jc w:val="left"/>
+            </w:pPr>
+            <w:r>
+              <w:rPr>
+                <w:sz w:val="20"/>
+                <w:szCs w:val="20"/>
+              </w:rPr>
+              <w:t xml:space="preserve">8–32</w:t>
+            </w:r>
+          </w:p>
+        </w:tc>
+        <w:tc>
+          <w:tcPr>
+            <w:tcW w:w="5338" w:type="dxa"/>
+          </w:tcPr>
+          <w:p>
+            <w:pPr>
+              <w:spacing w:before="0" w:after="0"/>
+              <w:jc w:val="left"/>
+            </w:pPr>
+            <w:r>
+              <w:rPr>
+                <w:sz w:val="20"/>
+                <w:szCs w:val="20"/>
+              </w:rPr>
+              <w:t xml:space="preserve">Navigation map of the signed-in area and the skip link</w:t>
+            </w:r>
+          </w:p>
+        </w:tc>
+      </w:tr>
+      <w:tr>
+        <w:trPr>
+          <w:cantSplit/>
+        </w:trPr>
+        <w:tc>
+          <w:tcPr>
+            <w:tcW w:w="3000" w:type="dxa"/>
+          </w:tcPr>
+          <w:p>
+            <w:pPr>
+              <w:spacing w:before="0" w:after="0"/>
+              <w:jc w:val="left"/>
+            </w:pPr>
+            <w:r>
+              <w:rPr>
+                <w:sz w:val="20"/>
+                <w:szCs w:val="20"/>
+              </w:rPr>
+              <w:t xml:space="preserve">studenthub/sidebar.php</w:t>
+            </w:r>
+          </w:p>
+        </w:tc>
+        <w:tc>
+          <w:tcPr>
+            <w:tcW w:w="1300" w:type="dxa"/>
+          </w:tcPr>
+          <w:p>
+            <w:pPr>
+              <w:spacing w:before="0" w:after="0"/>
+              <w:jc w:val="left"/>
+            </w:pPr>
+            <w:r>
+              <w:rPr>
+                <w:sz w:val="20"/>
+                <w:szCs w:val="20"/>
+              </w:rPr>
+              <w:t xml:space="preserve">67–78</w:t>
+            </w:r>
+          </w:p>
+        </w:tc>
+        <w:tc>
+          <w:tcPr>
+            <w:tcW w:w="5338" w:type="dxa"/>
+          </w:tcPr>
+          <w:p>
+            <w:pPr>
+              <w:spacing w:before="0" w:after="0"/>
+              <w:jc w:val="left"/>
+            </w:pPr>
+            <w:r>
+              <w:rPr>
+                <w:sz w:val="20"/>
+                <w:szCs w:val="20"/>
+              </w:rPr>
+              <w:t xml:space="preserve">Loop that renders the menu and the admin-only link</w:t>
+            </w:r>
+          </w:p>
+        </w:tc>
+      </w:tr>
+    </w:tbl>
+    <w:p>
+      <w:pPr>
+        <w:spacing w:before="0" w:after="120"/>
+      </w:pPr>
+      <w:r>
+        <w:t xml:space="preserve"/>
+      </w:r>
+    </w:p>
+    <w:p>
+      <w:pPr>
+        <w:pStyle w:val="Heading2"/>
+        <w:keepNext/>
+      </w:pPr>
+      <w:r>
+        <w:t xml:space="preserve">11.1 Home page: document structure and metadata</w:t>
+      </w:r>
+    </w:p>
+    <w:p>
+      <w:pPr>
+        <w:pStyle w:val="Code"/>
+        <w:spacing w:before="0" w:after="0"/>
+        <w:ind w:left="552" w:hanging="352"/>
+      </w:pPr>
+      <w:r>
+        <w:rPr>
+          <w:rFonts w:ascii="Consolas" w:hAnsi="Consolas" w:cs="Consolas"/>
+          <w:sz w:val="16"/>
+          <w:szCs w:val="16"/>
+        </w:rPr>
+        <w:t xml:space="preserve">18  &lt;!DOCTYPE html&gt;</w:t>
+      </w:r>
+    </w:p>
+    <w:p>
+      <w:pPr>
+        <w:pStyle w:val="Code"/>
+        <w:spacing w:before="0" w:after="0"/>
+        <w:ind w:left="552" w:hanging="352"/>
+      </w:pPr>
+      <w:r>
+        <w:rPr>
+          <w:rFonts w:ascii="Consolas" w:hAnsi="Consolas" w:cs="Consolas"/>
+          <w:sz w:val="16"/>
+          <w:szCs w:val="16"/>
+        </w:rPr>
+        <w:t xml:space="preserve">19  &lt;html lang="en"&gt;</w:t>
+      </w:r>
+    </w:p>
+    <w:p>
+      <w:pPr>
+        <w:pStyle w:val="Code"/>
+        <w:spacing w:before="0" w:after="0"/>
+        <w:ind w:left="552" w:hanging="352"/>
+      </w:pPr>
+      <w:r>
+        <w:rPr>
+          <w:rFonts w:ascii="Consolas" w:hAnsi="Consolas" w:cs="Consolas"/>
+          <w:sz w:val="16"/>
+          <w:szCs w:val="16"/>
+        </w:rPr>
+        <w:t xml:space="preserve">20  &lt;head&gt;</w:t>
+      </w:r>
+    </w:p>
+    <w:p>
+      <w:pPr>
+        <w:pStyle w:val="Code"/>
+        <w:spacing w:before="0" w:after="0"/>
+        <w:ind w:left="552" w:hanging="352"/>
+      </w:pPr>
+      <w:r>
+        <w:rPr>
+          <w:rFonts w:ascii="Consolas" w:hAnsi="Consolas" w:cs="Consolas"/>
+          <w:sz w:val="16"/>
+          <w:szCs w:val="16"/>
+        </w:rPr>
+        <w:t xml:space="preserve">21      &lt;meta charset="UTF-8"&gt;</w:t>
+      </w:r>
+    </w:p>
+    <w:p>
+      <w:pPr>
+        <w:pStyle w:val="Code"/>
+        <w:spacing w:before="0" w:after="0"/>
+        <w:ind w:left="552" w:hanging="352"/>
+      </w:pPr>
+      <w:r>
+        <w:rPr>
+          <w:rFonts w:ascii="Consolas" w:hAnsi="Consolas" w:cs="Consolas"/>
+          <w:sz w:val="16"/>
+          <w:szCs w:val="16"/>
+        </w:rPr>
+        <w:t xml:space="preserve">22      &lt;meta name="viewport" content="width=device-width, initial-scale=1.0"&gt;</w:t>
+      </w:r>
+    </w:p>
+    <w:p>
+      <w:pPr>
+        <w:pStyle w:val="Code"/>
+        <w:spacing w:before="0" w:after="0"/>
+        <w:ind w:left="552" w:hanging="352"/>
+      </w:pPr>
+      <w:r>
+        <w:rPr>
+          <w:rFonts w:ascii="Consolas" w:hAnsi="Consolas" w:cs="Consolas"/>
+          <w:sz w:val="16"/>
+          <w:szCs w:val="16"/>
+        </w:rPr>
+        <w:t xml:space="preserve">23      &lt;title&gt;StudentHub - CSPIT Charusat Portal&lt;/title&gt;</w:t>
+      </w:r>
+    </w:p>
+    <w:p>
+      <w:pPr>
+        <w:pStyle w:val="Code"/>
+        <w:spacing w:before="0" w:after="0"/>
+        <w:ind w:left="552" w:hanging="352"/>
+      </w:pPr>
+      <w:r>
+        <w:rPr>
+          <w:rFonts w:ascii="Consolas" w:hAnsi="Consolas" w:cs="Consolas"/>
+          <w:sz w:val="16"/>
+          <w:szCs w:val="16"/>
+        </w:rPr>
+        <w:t xml:space="preserve">24      &lt;link rel="stylesheet" href="assets/css/home.css?v=1"&gt;</w:t>
+      </w:r>
+    </w:p>
+    <w:p>
+      <w:pPr>
+        <w:pStyle w:val="Code"/>
+        <w:spacing w:before="0" w:after="0"/>
+        <w:ind w:left="552" w:hanging="352"/>
+      </w:pPr>
+      <w:r>
+        <w:rPr>
+          <w:rFonts w:ascii="Consolas" w:hAnsi="Consolas" w:cs="Consolas"/>
+          <w:sz w:val="16"/>
+          <w:szCs w:val="16"/>
+        </w:rPr>
+        <w:t xml:space="preserve">25      &lt;script src="assets/js/theme.js"&gt;&lt;/script&gt;</w:t>
+      </w:r>
+    </w:p>
+    <w:p>
+      <w:pPr>
+        <w:pStyle w:val="Code"/>
+        <w:spacing w:before="0" w:after="0"/>
+        <w:ind w:left="552" w:hanging="352"/>
+      </w:pPr>
+      <w:r>
+        <w:rPr>
+          <w:rFonts w:ascii="Consolas" w:hAnsi="Consolas" w:cs="Consolas"/>
+          <w:sz w:val="16"/>
+          <w:szCs w:val="16"/>
+        </w:rPr>
+        <w:t xml:space="preserve">26  &lt;/head&gt;</w:t>
+      </w:r>
+    </w:p>
+    <w:p>
+      <w:pPr>
+        <w:pStyle w:val="Code"/>
+        <w:spacing w:before="0" w:after="0"/>
+        <w:ind w:left="552" w:hanging="352"/>
+      </w:pPr>
+      <w:r>
+        <w:rPr>
+          <w:rFonts w:ascii="Consolas" w:hAnsi="Consolas" w:cs="Consolas"/>
+          <w:sz w:val="16"/>
+          <w:szCs w:val="16"/>
+        </w:rPr>
+        <w:t xml:space="preserve">27  &lt;body&gt;</w:t>
+      </w:r>
+    </w:p>
+    <w:p>
+      <w:pPr>
+        <w:spacing w:before="0" w:after="120"/>
+      </w:pPr>
+      <w:r>
+        <w:t xml:space="preserve"/>
+      </w:r>
+    </w:p>
+    <w:p>
+      <w:pPr>
+        <w:pStyle w:val="ListParagraph"/>
+        <w:numPr>
+          <w:ilvl w:val="0"/>
+          <w:numId w:val="1"/>
+        </w:numPr>
+        <w:spacing w:before="0" w:after="60"/>
+      </w:pPr>
+      <w:r>
+        <w:rPr>
+          <w:b/>
+        </w:rPr>
+        <w:t xml:space="preserve">Document type and language: </w:t>
+      </w:r>
+      <w:r>
+        <w:t xml:space="preserve">&lt;!DOCTYPE html&gt; selects standards mode; lang="en" tells browsers and screen readers the page language.</w:t>
+      </w:r>
+    </w:p>
+    <w:p>
+      <w:pPr>
+        <w:pStyle w:val="ListParagraph"/>
+        <w:numPr>
+          <w:ilvl w:val="0"/>
+          <w:numId w:val="1"/>
+        </w:numPr>
+        <w:spacing w:before="0" w:after="60"/>
+      </w:pPr>
+      <w:r>
+        <w:rPr>
+          <w:b/>
+        </w:rPr>
+        <w:t xml:space="preserve">Metadata: </w:t>
+      </w:r>
+      <w:r>
+        <w:t xml:space="preserve">UTF-8 character set, a viewport tag for correct scaling on phones, and a descriptive page title.</w:t>
+      </w:r>
+    </w:p>
+    <w:p>
+      <w:pPr>
+        <w:pStyle w:val="ListParagraph"/>
+        <w:numPr>
+          <w:ilvl w:val="0"/>
+          <w:numId w:val="1"/>
+        </w:numPr>
+        <w:spacing w:before="0" w:after="60"/>
+      </w:pPr>
+      <w:r>
+        <w:rPr>
+          <w:b/>
+        </w:rPr>
+        <w:t xml:space="preserve">Stylesheet and script: </w:t>
+      </w:r>
+      <w:r>
+        <w:t xml:space="preserve">home.css styles the public page (it imports the shared design tokens, web font and Bootstrap Icons); theme.js applies the saved light/dark theme before the page is drawn.</w:t>
+      </w:r>
+    </w:p>
+    <w:p>
+      <w:pPr>
+        <w:pStyle w:val="Heading2"/>
+        <w:keepNext/>
+      </w:pPr>
+      <w:r>
+        <w:t xml:space="preserve">11.2 Home page: header and navigation</w:t>
+      </w:r>
+    </w:p>
+    <w:p>
+      <w:pPr>
+        <w:pStyle w:val="Code"/>
+        <w:spacing w:before="0" w:after="0"/>
+        <w:ind w:left="552" w:hanging="352"/>
+      </w:pPr>
+      <w:r>
+        <w:rPr>
+          <w:rFonts w:ascii="Consolas" w:hAnsi="Consolas" w:cs="Consolas"/>
+          <w:sz w:val="16"/>
+          <w:szCs w:val="16"/>
+        </w:rPr>
+        <w:t xml:space="preserve">36  &lt;header class="site-header"&gt;</w:t>
+      </w:r>
+    </w:p>
+    <w:p>
+      <w:pPr>
+        <w:pStyle w:val="Code"/>
+        <w:spacing w:before="0" w:after="0"/>
+        <w:ind w:left="552" w:hanging="352"/>
+      </w:pPr>
+      <w:r>
+        <w:rPr>
+          <w:rFonts w:ascii="Consolas" w:hAnsi="Consolas" w:cs="Consolas"/>
+          <w:sz w:val="16"/>
+          <w:szCs w:val="16"/>
+        </w:rPr>
+        <w:t xml:space="preserve">37      &lt;div class="topnav"&gt;</w:t>
+      </w:r>
+    </w:p>
+    <w:p>
+      <w:pPr>
+        <w:pStyle w:val="Code"/>
+        <w:spacing w:before="0" w:after="0"/>
+        <w:ind w:left="552" w:hanging="352"/>
+      </w:pPr>
+      <w:r>
+        <w:rPr>
+          <w:rFonts w:ascii="Consolas" w:hAnsi="Consolas" w:cs="Consolas"/>
+          <w:sz w:val="16"/>
+          <w:szCs w:val="16"/>
+        </w:rPr>
+        <w:t xml:space="preserve">38          &lt;a class="site-brand" href="index.php"&gt;</w:t>
+      </w:r>
+    </w:p>
+    <w:p>
+      <w:pPr>
+        <w:pStyle w:val="Code"/>
+        <w:spacing w:before="0" w:after="0"/>
+        <w:ind w:left="552" w:hanging="352"/>
+      </w:pPr>
+      <w:r>
+        <w:rPr>
+          <w:rFonts w:ascii="Consolas" w:hAnsi="Consolas" w:cs="Consolas"/>
+          <w:sz w:val="16"/>
+          <w:szCs w:val="16"/>
+        </w:rPr>
+        <w:t xml:space="preserve">39              &lt;span class="brand-mark" aria-hidden="true"&gt;&lt;i class="bi bi-mortarboard-fill"&gt;&lt;/i&gt;&lt;/span&gt;</w:t>
+      </w:r>
+    </w:p>
+    <w:p>
+      <w:pPr>
+        <w:pStyle w:val="Code"/>
+        <w:spacing w:before="0" w:after="0"/>
+        <w:ind w:left="552" w:hanging="352"/>
+      </w:pPr>
+      <w:r>
+        <w:rPr>
+          <w:rFonts w:ascii="Consolas" w:hAnsi="Consolas" w:cs="Consolas"/>
+          <w:sz w:val="16"/>
+          <w:szCs w:val="16"/>
+        </w:rPr>
+        <w:t xml:space="preserve">40              &lt;span&gt;&lt;strong&gt;StudentHub&lt;/strong&gt;&lt;small&gt;CSPIT · CHARUSAT&lt;/small&gt;&lt;/span&gt;</w:t>
+      </w:r>
+    </w:p>
+    <w:p>
+      <w:pPr>
+        <w:pStyle w:val="Code"/>
+        <w:spacing w:before="0" w:after="0"/>
+        <w:ind w:left="552" w:hanging="352"/>
+      </w:pPr>
+      <w:r>
+        <w:rPr>
+          <w:rFonts w:ascii="Consolas" w:hAnsi="Consolas" w:cs="Consolas"/>
+          <w:sz w:val="16"/>
+          <w:szCs w:val="16"/>
+        </w:rPr>
+        <w:t xml:space="preserve">41          &lt;/a&gt;</w:t>
+      </w:r>
+    </w:p>
+    <w:p>
+      <w:pPr>
+        <w:pStyle w:val="Code"/>
+        <w:spacing w:before="0" w:after="0"/>
+        <w:ind w:left="552" w:hanging="352"/>
+      </w:pPr>
+      <w:r>
+        <w:rPr>
+          <w:rFonts w:ascii="Consolas" w:hAnsi="Consolas" w:cs="Consolas"/>
+          <w:sz w:val="16"/>
+          <w:szCs w:val="16"/>
+        </w:rPr>
+        <w:t xml:space="preserve">42          &lt;button class="theme-toggle" id="theme-toggle-btn" type="button"&gt;&lt;i class="bi bi-moon-stars" aria-hidden="true"&gt;&lt;/i&gt; Dark&lt;/button&gt;</w:t>
+      </w:r>
+    </w:p>
+    <w:p>
+      <w:pPr>
+        <w:pStyle w:val="Code"/>
+        <w:spacing w:before="0" w:after="0"/>
+        <w:ind w:left="552" w:hanging="352"/>
+      </w:pPr>
+      <w:r>
+        <w:rPr>
+          <w:rFonts w:ascii="Consolas" w:hAnsi="Consolas" w:cs="Consolas"/>
+          <w:sz w:val="16"/>
+          <w:szCs w:val="16"/>
+        </w:rPr>
+        <w:t xml:space="preserve">43          &lt;button class="hamburger" id="hamburger-menu" type="button" aria-label="Toggle navigation menu"&gt;&lt;i class="bi bi-list" aria-hidden="true"&gt;&lt;/i&gt;&lt;/button&gt;</w:t>
+      </w:r>
+    </w:p>
+    <w:p>
+      <w:pPr>
+        <w:pStyle w:val="Code"/>
+        <w:spacing w:before="0" w:after="0"/>
+        <w:ind w:left="552" w:hanging="352"/>
+      </w:pPr>
+      <w:r>
+        <w:rPr>
+          <w:rFonts w:ascii="Consolas" w:hAnsi="Consolas" w:cs="Consolas"/>
+          <w:sz w:val="16"/>
+          <w:szCs w:val="16"/>
+        </w:rPr>
+        <w:t xml:space="preserve">44  </w:t>
+      </w:r>
+    </w:p>
+    <w:p>
+      <w:pPr>
+        <w:pStyle w:val="Code"/>
+        <w:spacing w:before="0" w:after="0"/>
+        <w:ind w:left="552" w:hanging="352"/>
+      </w:pPr>
+      <w:r>
+        <w:rPr>
+          <w:rFonts w:ascii="Consolas" w:hAnsi="Consolas" w:cs="Consolas"/>
+          <w:sz w:val="16"/>
+          <w:szCs w:val="16"/>
+        </w:rPr>
+        <w:t xml:space="preserve">45          &lt;!-- Navigation (collapses behind the hamburger on phones – Practical 4) --&gt;</w:t>
+      </w:r>
+    </w:p>
+    <w:p>
+      <w:pPr>
+        <w:pStyle w:val="Code"/>
+        <w:spacing w:before="0" w:after="0"/>
+        <w:ind w:left="552" w:hanging="352"/>
+      </w:pPr>
+      <w:r>
+        <w:rPr>
+          <w:rFonts w:ascii="Consolas" w:hAnsi="Consolas" w:cs="Consolas"/>
+          <w:sz w:val="16"/>
+          <w:szCs w:val="16"/>
+        </w:rPr>
+        <w:t xml:space="preserve">46          &lt;nav class="hero-nav" aria-label="Main navigation"&gt;</w:t>
+      </w:r>
+    </w:p>
+    <w:p>
+      <w:pPr>
+        <w:pStyle w:val="Code"/>
+        <w:spacing w:before="0" w:after="0"/>
+        <w:ind w:left="552" w:hanging="352"/>
+      </w:pPr>
+      <w:r>
+        <w:rPr>
+          <w:rFonts w:ascii="Consolas" w:hAnsi="Consolas" w:cs="Consolas"/>
+          <w:sz w:val="16"/>
+          <w:szCs w:val="16"/>
+        </w:rPr>
+        <w:t xml:space="preserve">47              &lt;ul id="nav-links"&gt;</w:t>
+      </w:r>
+    </w:p>
+    <w:p>
+      <w:pPr>
+        <w:pStyle w:val="Code"/>
+        <w:spacing w:before="0" w:after="0"/>
+        <w:ind w:left="552" w:hanging="352"/>
+      </w:pPr>
+      <w:r>
+        <w:rPr>
+          <w:rFonts w:ascii="Consolas" w:hAnsi="Consolas" w:cs="Consolas"/>
+          <w:sz w:val="16"/>
+          <w:szCs w:val="16"/>
+        </w:rPr>
+        <w:t xml:space="preserve">48                  &lt;li&gt;&lt;a href="index.php" class="active" aria-current="page"&gt;Home&lt;/a&gt;&lt;/li&gt;</w:t>
+      </w:r>
+    </w:p>
+    <w:p>
+      <w:pPr>
+        <w:pStyle w:val="Code"/>
+        <w:spacing w:before="0" w:after="0"/>
+        <w:ind w:left="552" w:hanging="352"/>
+      </w:pPr>
+      <w:r>
+        <w:rPr>
+          <w:rFonts w:ascii="Consolas" w:hAnsi="Consolas" w:cs="Consolas"/>
+          <w:sz w:val="16"/>
+          <w:szCs w:val="16"/>
+        </w:rPr>
+        <w:t xml:space="preserve">49                  &lt;?php if ($is_logged_in): ?&gt;</w:t>
+      </w:r>
+    </w:p>
+    <w:p>
+      <w:pPr>
+        <w:pStyle w:val="Code"/>
+        <w:spacing w:before="0" w:after="0"/>
+        <w:ind w:left="552" w:hanging="352"/>
+      </w:pPr>
+      <w:r>
+        <w:rPr>
+          <w:rFonts w:ascii="Consolas" w:hAnsi="Consolas" w:cs="Consolas"/>
+          <w:sz w:val="16"/>
+          <w:szCs w:val="16"/>
+        </w:rPr>
+        <w:t xml:space="preserve">50                      &lt;li&gt;&lt;a href="dashboard.php"&gt;Dashboard&lt;/a&gt;&lt;/li&gt;</w:t>
+      </w:r>
+    </w:p>
+    <w:p>
+      <w:pPr>
+        <w:pStyle w:val="Code"/>
+        <w:spacing w:before="0" w:after="0"/>
+        <w:ind w:left="552" w:hanging="352"/>
+      </w:pPr>
+      <w:r>
+        <w:rPr>
+          <w:rFonts w:ascii="Consolas" w:hAnsi="Consolas" w:cs="Consolas"/>
+          <w:sz w:val="16"/>
+          <w:szCs w:val="16"/>
+        </w:rPr>
+        <w:t xml:space="preserve">51                      &lt;li&gt;&lt;a href="profile.php"&gt;My Profile&lt;/a&gt;&lt;/li&gt;</w:t>
+      </w:r>
+    </w:p>
+    <w:p>
+      <w:pPr>
+        <w:pStyle w:val="Code"/>
+        <w:spacing w:before="0" w:after="0"/>
+        <w:ind w:left="552" w:hanging="352"/>
+      </w:pPr>
+      <w:r>
+        <w:rPr>
+          <w:rFonts w:ascii="Consolas" w:hAnsi="Consolas" w:cs="Consolas"/>
+          <w:sz w:val="16"/>
+          <w:szCs w:val="16"/>
+        </w:rPr>
+        <w:t xml:space="preserve">52                      &lt;li&gt;&lt;a href="courses.php"&gt;Courses&lt;/a&gt;&lt;/li&gt;</w:t>
+      </w:r>
+    </w:p>
+    <w:p>
+      <w:pPr>
+        <w:pStyle w:val="Code"/>
+        <w:spacing w:before="0" w:after="0"/>
+        <w:ind w:left="552" w:hanging="352"/>
+      </w:pPr>
+      <w:r>
+        <w:rPr>
+          <w:rFonts w:ascii="Consolas" w:hAnsi="Consolas" w:cs="Consolas"/>
+          <w:sz w:val="16"/>
+          <w:szCs w:val="16"/>
+        </w:rPr>
+        <w:t xml:space="preserve">53                      &lt;li&gt;&lt;a href="attendance.php"&gt;Attendance&lt;/a&gt;&lt;/li&gt;</w:t>
+      </w:r>
+    </w:p>
+    <w:p>
+      <w:pPr>
+        <w:pStyle w:val="Code"/>
+        <w:spacing w:before="0" w:after="0"/>
+        <w:ind w:left="552" w:hanging="352"/>
+      </w:pPr>
+      <w:r>
+        <w:rPr>
+          <w:rFonts w:ascii="Consolas" w:hAnsi="Consolas" w:cs="Consolas"/>
+          <w:sz w:val="16"/>
+          <w:szCs w:val="16"/>
+        </w:rPr>
+        <w:t xml:space="preserve">54                      &lt;?php if ($user_role === "admin"): ?&gt;</w:t>
+      </w:r>
+    </w:p>
+    <w:p>
+      <w:pPr>
+        <w:pStyle w:val="Code"/>
+        <w:spacing w:before="0" w:after="0"/>
+        <w:ind w:left="552" w:hanging="352"/>
+      </w:pPr>
+      <w:r>
+        <w:rPr>
+          <w:rFonts w:ascii="Consolas" w:hAnsi="Consolas" w:cs="Consolas"/>
+          <w:sz w:val="16"/>
+          <w:szCs w:val="16"/>
+        </w:rPr>
+        <w:t xml:space="preserve">55                          &lt;li&gt;&lt;a href="admin_dashboard.php" class="nav-admin"&gt;&lt;i class="bi bi-shield-lock" aria-hidden="true"&gt;&lt;/i&gt; Admin Console&lt;/a&gt;&lt;/li&gt;</w:t>
+      </w:r>
+    </w:p>
+    <w:p>
+      <w:pPr>
+        <w:pStyle w:val="Code"/>
+        <w:spacing w:before="0" w:after="0"/>
+        <w:ind w:left="552" w:hanging="352"/>
+      </w:pPr>
+      <w:r>
+        <w:rPr>
+          <w:rFonts w:ascii="Consolas" w:hAnsi="Consolas" w:cs="Consolas"/>
+          <w:sz w:val="16"/>
+          <w:szCs w:val="16"/>
+        </w:rPr>
+        <w:t xml:space="preserve">56                      &lt;?php endif; ?&gt;</w:t>
+      </w:r>
+    </w:p>
+    <w:p>
+      <w:pPr>
+        <w:pStyle w:val="Code"/>
+        <w:spacing w:before="0" w:after="0"/>
+        <w:ind w:left="552" w:hanging="352"/>
+      </w:pPr>
+      <w:r>
+        <w:rPr>
+          <w:rFonts w:ascii="Consolas" w:hAnsi="Consolas" w:cs="Consolas"/>
+          <w:sz w:val="16"/>
+          <w:szCs w:val="16"/>
+        </w:rPr>
+        <w:t xml:space="preserve">57                      &lt;li&gt;&lt;a href="logout.php"&gt;Logout&lt;/a&gt;&lt;/li&gt;</w:t>
+      </w:r>
+    </w:p>
+    <w:p>
+      <w:pPr>
+        <w:pStyle w:val="Code"/>
+        <w:spacing w:before="0" w:after="0"/>
+        <w:ind w:left="552" w:hanging="352"/>
+      </w:pPr>
+      <w:r>
+        <w:rPr>
+          <w:rFonts w:ascii="Consolas" w:hAnsi="Consolas" w:cs="Consolas"/>
+          <w:sz w:val="16"/>
+          <w:szCs w:val="16"/>
+        </w:rPr>
+        <w:t xml:space="preserve">58                  &lt;?php else: ?&gt;</w:t>
+      </w:r>
+    </w:p>
+    <w:p>
+      <w:pPr>
+        <w:pStyle w:val="Code"/>
+        <w:spacing w:before="0" w:after="0"/>
+        <w:ind w:left="552" w:hanging="352"/>
+      </w:pPr>
+      <w:r>
+        <w:rPr>
+          <w:rFonts w:ascii="Consolas" w:hAnsi="Consolas" w:cs="Consolas"/>
+          <w:sz w:val="16"/>
+          <w:szCs w:val="16"/>
+        </w:rPr>
+        <w:t xml:space="preserve">59                      &lt;li&gt;&lt;a href="login.php"&gt;Login&lt;/a&gt;&lt;/li&gt;</w:t>
+      </w:r>
+    </w:p>
+    <w:p>
+      <w:pPr>
+        <w:pStyle w:val="Code"/>
+        <w:spacing w:before="0" w:after="0"/>
+        <w:ind w:left="552" w:hanging="352"/>
+      </w:pPr>
+      <w:r>
+        <w:rPr>
+          <w:rFonts w:ascii="Consolas" w:hAnsi="Consolas" w:cs="Consolas"/>
+          <w:sz w:val="16"/>
+          <w:szCs w:val="16"/>
+        </w:rPr>
+        <w:t xml:space="preserve">60                      &lt;li&gt;&lt;a href="register.php"&gt;Register&lt;/a&gt;&lt;/li&gt;</w:t>
+      </w:r>
+    </w:p>
+    <w:p>
+      <w:pPr>
+        <w:pStyle w:val="Code"/>
+        <w:spacing w:before="0" w:after="0"/>
+        <w:ind w:left="552" w:hanging="352"/>
+      </w:pPr>
+      <w:r>
+        <w:rPr>
+          <w:rFonts w:ascii="Consolas" w:hAnsi="Consolas" w:cs="Consolas"/>
+          <w:sz w:val="16"/>
+          <w:szCs w:val="16"/>
+        </w:rPr>
+        <w:t xml:space="preserve">61                      &lt;li&gt;&lt;a href="dashboard.php"&gt;Dashboard&lt;/a&gt;&lt;/li&gt;</w:t>
+      </w:r>
+    </w:p>
+    <w:p>
+      <w:pPr>
+        <w:pStyle w:val="Code"/>
+        <w:spacing w:before="0" w:after="0"/>
+        <w:ind w:left="552" w:hanging="352"/>
+      </w:pPr>
+      <w:r>
+        <w:rPr>
+          <w:rFonts w:ascii="Consolas" w:hAnsi="Consolas" w:cs="Consolas"/>
+          <w:sz w:val="16"/>
+          <w:szCs w:val="16"/>
+        </w:rPr>
+        <w:t xml:space="preserve">62                      &lt;li&gt;&lt;a href="contact.php"&gt;Contact Us&lt;/a&gt;&lt;/li&gt;</w:t>
+      </w:r>
+    </w:p>
+    <w:p>
+      <w:pPr>
+        <w:pStyle w:val="Code"/>
+        <w:spacing w:before="0" w:after="0"/>
+        <w:ind w:left="552" w:hanging="352"/>
+      </w:pPr>
+      <w:r>
+        <w:rPr>
+          <w:rFonts w:ascii="Consolas" w:hAnsi="Consolas" w:cs="Consolas"/>
+          <w:sz w:val="16"/>
+          <w:szCs w:val="16"/>
+        </w:rPr>
+        <w:t xml:space="preserve">63                  &lt;?php endif; ?&gt;</w:t>
+      </w:r>
+    </w:p>
+    <w:p>
+      <w:pPr>
+        <w:pStyle w:val="Code"/>
+        <w:spacing w:before="0" w:after="0"/>
+        <w:ind w:left="552" w:hanging="352"/>
+      </w:pPr>
+      <w:r>
+        <w:rPr>
+          <w:rFonts w:ascii="Consolas" w:hAnsi="Consolas" w:cs="Consolas"/>
+          <w:sz w:val="16"/>
+          <w:szCs w:val="16"/>
+        </w:rPr>
+        <w:t xml:space="preserve">64              &lt;/ul&gt;</w:t>
+      </w:r>
+    </w:p>
+    <w:p>
+      <w:pPr>
+        <w:pStyle w:val="Code"/>
+        <w:spacing w:before="0" w:after="0"/>
+        <w:ind w:left="552" w:hanging="352"/>
+      </w:pPr>
+      <w:r>
+        <w:rPr>
+          <w:rFonts w:ascii="Consolas" w:hAnsi="Consolas" w:cs="Consolas"/>
+          <w:sz w:val="16"/>
+          <w:szCs w:val="16"/>
+        </w:rPr>
+        <w:t xml:space="preserve">65          &lt;/nav&gt;</w:t>
+      </w:r>
+    </w:p>
+    <w:p>
+      <w:pPr>
+        <w:spacing w:before="0" w:after="120"/>
+      </w:pPr>
+      <w:r>
+        <w:t xml:space="preserve"/>
+      </w:r>
+    </w:p>
+    <w:p>
+      <w:pPr>
+        <w:pStyle w:val="ListParagraph"/>
+        <w:numPr>
+          <w:ilvl w:val="0"/>
+          <w:numId w:val="1"/>
+        </w:numPr>
+        <w:spacing w:before="0" w:after="60"/>
+      </w:pPr>
+      <w:r>
+        <w:rPr>
+          <w:b/>
+        </w:rPr>
+        <w:t xml:space="preserve">Semantic landmarks: </w:t>
+      </w:r>
+      <w:r>
+        <w:t xml:space="preserve">&lt;header&gt; holds the site brand and a &lt;nav&gt; labelled "Main navigation" for assistive technology; icons are hidden from screen readers with aria-hidden.</w:t>
+      </w:r>
+    </w:p>
+    <w:p>
+      <w:pPr>
+        <w:pStyle w:val="ListParagraph"/>
+        <w:numPr>
+          <w:ilvl w:val="0"/>
+          <w:numId w:val="1"/>
+        </w:numPr>
+        <w:spacing w:before="0" w:after="60"/>
+      </w:pPr>
+      <w:r>
+        <w:rPr>
+          <w:b/>
+        </w:rPr>
+        <w:t xml:space="preserve">Navigation flow: </w:t>
+      </w:r>
+      <w:r>
+        <w:t xml:space="preserve">visitors see Home, Login, Register, Dashboard and Contact Us; signed-in users see Dashboard, My Profile, Courses, Attendance and Logout, and admins also get the Admin Console link. The PHP session decides which list is printed.</w:t>
+      </w:r>
+    </w:p>
+    <w:p>
+      <w:pPr>
+        <w:pStyle w:val="ListParagraph"/>
+        <w:numPr>
+          <w:ilvl w:val="0"/>
+          <w:numId w:val="1"/>
+        </w:numPr>
+        <w:spacing w:before="0" w:after="60"/>
+      </w:pPr>
+      <w:r>
+        <w:rPr>
+          <w:b/>
+        </w:rPr>
+        <w:t xml:space="preserve">Responsive menu: </w:t>
+      </w:r>
+      <w:r>
+        <w:t xml:space="preserve">on narrow screens the list collapses behind the hamburger button (#hamburger-menu), which script.js toggles.</w:t>
+      </w:r>
+    </w:p>
+    <w:p>
+      <w:pPr>
+        <w:pStyle w:val="Heading2"/>
+        <w:keepNext/>
+      </w:pPr>
+      <w:r>
+        <w:t xml:space="preserve">11.3 Signed-in area: navigation map and skip link</w:t>
+      </w:r>
+    </w:p>
+    <w:p>
+      <w:pPr>
+        <w:pStyle w:val="Code"/>
+        <w:spacing w:before="0" w:after="0"/>
+        <w:ind w:left="552" w:hanging="352"/>
+      </w:pPr>
+      <w:r>
+        <w:rPr>
+          <w:rFonts w:ascii="Consolas" w:hAnsi="Consolas" w:cs="Consolas"/>
+          <w:sz w:val="16"/>
+          <w:szCs w:val="16"/>
+        </w:rPr>
+        <w:t xml:space="preserve"> 8  // Grouped navigation: [file, icon, label, pages that mark it active]</w:t>
+      </w:r>
+    </w:p>
+    <w:p>
+      <w:pPr>
+        <w:pStyle w:val="Code"/>
+        <w:spacing w:before="0" w:after="0"/>
+        <w:ind w:left="552" w:hanging="352"/>
+      </w:pPr>
+      <w:r>
+        <w:rPr>
+          <w:rFonts w:ascii="Consolas" w:hAnsi="Consolas" w:cs="Consolas"/>
+          <w:sz w:val="16"/>
+          <w:szCs w:val="16"/>
+        </w:rPr>
+        <w:t xml:space="preserve"> 9  $nav_groups = [</w:t>
+      </w:r>
+    </w:p>
+    <w:p>
+      <w:pPr>
+        <w:pStyle w:val="Code"/>
+        <w:spacing w:before="0" w:after="0"/>
+        <w:ind w:left="552" w:hanging="352"/>
+      </w:pPr>
+      <w:r>
+        <w:rPr>
+          <w:rFonts w:ascii="Consolas" w:hAnsi="Consolas" w:cs="Consolas"/>
+          <w:sz w:val="16"/>
+          <w:szCs w:val="16"/>
+        </w:rPr>
+        <w:t xml:space="preserve">10      "Overview" =&gt; [</w:t>
+      </w:r>
+    </w:p>
+    <w:p>
+      <w:pPr>
+        <w:pStyle w:val="Code"/>
+        <w:spacing w:before="0" w:after="0"/>
+        <w:ind w:left="552" w:hanging="352"/>
+      </w:pPr>
+      <w:r>
+        <w:rPr>
+          <w:rFonts w:ascii="Consolas" w:hAnsi="Consolas" w:cs="Consolas"/>
+          <w:sz w:val="16"/>
+          <w:szCs w:val="16"/>
+        </w:rPr>
+        <w:t xml:space="preserve">11          ["dashboard.php",     "bi-grid-1x2",         "Dashboard",     ["dashboard.php", "student_dashboard.php"]],</w:t>
+      </w:r>
+    </w:p>
+    <w:p>
+      <w:pPr>
+        <w:pStyle w:val="Code"/>
+        <w:spacing w:before="0" w:after="0"/>
+        <w:ind w:left="552" w:hanging="352"/>
+      </w:pPr>
+      <w:r>
+        <w:rPr>
+          <w:rFonts w:ascii="Consolas" w:hAnsi="Consolas" w:cs="Consolas"/>
+          <w:sz w:val="16"/>
+          <w:szCs w:val="16"/>
+        </w:rPr>
+        <w:t xml:space="preserve">12          ["profile.php",       "bi-person-circle",    "My Profile",    ["profile.php"]],</w:t>
+      </w:r>
+    </w:p>
+    <w:p>
+      <w:pPr>
+        <w:pStyle w:val="Code"/>
+        <w:spacing w:before="0" w:after="0"/>
+        <w:ind w:left="552" w:hanging="352"/>
+      </w:pPr>
+      <w:r>
+        <w:rPr>
+          <w:rFonts w:ascii="Consolas" w:hAnsi="Consolas" w:cs="Consolas"/>
+          <w:sz w:val="16"/>
+          <w:szCs w:val="16"/>
+        </w:rPr>
+        <w:t xml:space="preserve">13      ],</w:t>
+      </w:r>
+    </w:p>
+    <w:p>
+      <w:pPr>
+        <w:pStyle w:val="Code"/>
+        <w:spacing w:before="0" w:after="0"/>
+        <w:ind w:left="552" w:hanging="352"/>
+      </w:pPr>
+      <w:r>
+        <w:rPr>
+          <w:rFonts w:ascii="Consolas" w:hAnsi="Consolas" w:cs="Consolas"/>
+          <w:sz w:val="16"/>
+          <w:szCs w:val="16"/>
+        </w:rPr>
+        <w:t xml:space="preserve">14      "Academics" =&gt; [</w:t>
+      </w:r>
+    </w:p>
+    <w:p>
+      <w:pPr>
+        <w:pStyle w:val="Code"/>
+        <w:spacing w:before="0" w:after="0"/>
+        <w:ind w:left="552" w:hanging="352"/>
+      </w:pPr>
+      <w:r>
+        <w:rPr>
+          <w:rFonts w:ascii="Consolas" w:hAnsi="Consolas" w:cs="Consolas"/>
+          <w:sz w:val="16"/>
+          <w:szCs w:val="16"/>
+        </w:rPr>
+        <w:t xml:space="preserve">15          ["courses.php",       "bi-journal-bookmark", "Courses",       ["courses.php"]],</w:t>
+      </w:r>
+    </w:p>
+    <w:p>
+      <w:pPr>
+        <w:pStyle w:val="Code"/>
+        <w:spacing w:before="0" w:after="0"/>
+        <w:ind w:left="552" w:hanging="352"/>
+      </w:pPr>
+      <w:r>
+        <w:rPr>
+          <w:rFonts w:ascii="Consolas" w:hAnsi="Consolas" w:cs="Consolas"/>
+          <w:sz w:val="16"/>
+          <w:szCs w:val="16"/>
+        </w:rPr>
+        <w:t xml:space="preserve">16          ["attendance.php",    "bi-calendar-check",   "Attendance",    ["attendance.php"]],</w:t>
+      </w:r>
+    </w:p>
+    <w:p>
+      <w:pPr>
+        <w:pStyle w:val="Code"/>
+        <w:spacing w:before="0" w:after="0"/>
+        <w:ind w:left="552" w:hanging="352"/>
+      </w:pPr>
+      <w:r>
+        <w:rPr>
+          <w:rFonts w:ascii="Consolas" w:hAnsi="Consolas" w:cs="Consolas"/>
+          <w:sz w:val="16"/>
+          <w:szCs w:val="16"/>
+        </w:rPr>
+        <w:t xml:space="preserve">17          ["assignments.php",   "bi-pencil-square",    "Assignments",   ["assignments.php"]],</w:t>
+      </w:r>
+    </w:p>
+    <w:p>
+      <w:pPr>
+        <w:pStyle w:val="Code"/>
+        <w:spacing w:before="0" w:after="0"/>
+        <w:ind w:left="552" w:hanging="352"/>
+      </w:pPr>
+      <w:r>
+        <w:rPr>
+          <w:rFonts w:ascii="Consolas" w:hAnsi="Consolas" w:cs="Consolas"/>
+          <w:sz w:val="16"/>
+          <w:szCs w:val="16"/>
+        </w:rPr>
+        <w:t xml:space="preserve">18          ["results.php",       "bi-bar-chart-line",   "Results",       ["results.php"]],</w:t>
+      </w:r>
+    </w:p>
+    <w:p>
+      <w:pPr>
+        <w:pStyle w:val="Code"/>
+        <w:spacing w:before="0" w:after="0"/>
+        <w:ind w:left="552" w:hanging="352"/>
+      </w:pPr>
+      <w:r>
+        <w:rPr>
+          <w:rFonts w:ascii="Consolas" w:hAnsi="Consolas" w:cs="Consolas"/>
+          <w:sz w:val="16"/>
+          <w:szCs w:val="16"/>
+        </w:rPr>
+        <w:t xml:space="preserve">19          ["achievements.php",  "bi-award",            "Achievements",  ["achievements.php"]],</w:t>
+      </w:r>
+    </w:p>
+    <w:p>
+      <w:pPr>
+        <w:pStyle w:val="Code"/>
+        <w:spacing w:before="0" w:after="0"/>
+        <w:ind w:left="552" w:hanging="352"/>
+      </w:pPr>
+      <w:r>
+        <w:rPr>
+          <w:rFonts w:ascii="Consolas" w:hAnsi="Consolas" w:cs="Consolas"/>
+          <w:sz w:val="16"/>
+          <w:szCs w:val="16"/>
+        </w:rPr>
+        <w:t xml:space="preserve">20      ],</w:t>
+      </w:r>
+    </w:p>
+    <w:p>
+      <w:pPr>
+        <w:pStyle w:val="Code"/>
+        <w:spacing w:before="0" w:after="0"/>
+        <w:ind w:left="552" w:hanging="352"/>
+      </w:pPr>
+      <w:r>
+        <w:rPr>
+          <w:rFonts w:ascii="Consolas" w:hAnsi="Consolas" w:cs="Consolas"/>
+          <w:sz w:val="16"/>
+          <w:szCs w:val="16"/>
+        </w:rPr>
+        <w:t xml:space="preserve">21      "Campus" =&gt; [</w:t>
+      </w:r>
+    </w:p>
+    <w:p>
+      <w:pPr>
+        <w:pStyle w:val="Code"/>
+        <w:spacing w:before="0" w:after="0"/>
+        <w:ind w:left="552" w:hanging="352"/>
+      </w:pPr>
+      <w:r>
+        <w:rPr>
+          <w:rFonts w:ascii="Consolas" w:hAnsi="Consolas" w:cs="Consolas"/>
+          <w:sz w:val="16"/>
+          <w:szCs w:val="16"/>
+        </w:rPr>
+        <w:t xml:space="preserve">22          ["notifications.php", "bi-megaphone",        "Notices",       ["notifications.php"]],</w:t>
+      </w:r>
+    </w:p>
+    <w:p>
+      <w:pPr>
+        <w:pStyle w:val="Code"/>
+        <w:spacing w:before="0" w:after="0"/>
+        <w:ind w:left="552" w:hanging="352"/>
+      </w:pPr>
+      <w:r>
+        <w:rPr>
+          <w:rFonts w:ascii="Consolas" w:hAnsi="Consolas" w:cs="Consolas"/>
+          <w:sz w:val="16"/>
+          <w:szCs w:val="16"/>
+        </w:rPr>
+        <w:t xml:space="preserve">23          ["directory.php",     "bi-people",           "Directory",     ["directory.php"]],</w:t>
+      </w:r>
+    </w:p>
+    <w:p>
+      <w:pPr>
+        <w:pStyle w:val="Code"/>
+        <w:spacing w:before="0" w:after="0"/>
+        <w:ind w:left="552" w:hanging="352"/>
+      </w:pPr>
+      <w:r>
+        <w:rPr>
+          <w:rFonts w:ascii="Consolas" w:hAnsi="Consolas" w:cs="Consolas"/>
+          <w:sz w:val="16"/>
+          <w:szCs w:val="16"/>
+        </w:rPr>
+        <w:t xml:space="preserve">24          ["contact.php",       "bi-life-preserver",   "Help &amp; Contact", ["contact.php"]],</w:t>
+      </w:r>
+    </w:p>
+    <w:p>
+      <w:pPr>
+        <w:pStyle w:val="Code"/>
+        <w:spacing w:before="0" w:after="0"/>
+        <w:ind w:left="552" w:hanging="352"/>
+      </w:pPr>
+      <w:r>
+        <w:rPr>
+          <w:rFonts w:ascii="Consolas" w:hAnsi="Consolas" w:cs="Consolas"/>
+          <w:sz w:val="16"/>
+          <w:szCs w:val="16"/>
+        </w:rPr>
+        <w:t xml:space="preserve">25      ],</w:t>
+      </w:r>
+    </w:p>
+    <w:p>
+      <w:pPr>
+        <w:pStyle w:val="Code"/>
+        <w:spacing w:before="0" w:after="0"/>
+        <w:ind w:left="552" w:hanging="352"/>
+      </w:pPr>
+      <w:r>
+        <w:rPr>
+          <w:rFonts w:ascii="Consolas" w:hAnsi="Consolas" w:cs="Consolas"/>
+          <w:sz w:val="16"/>
+          <w:szCs w:val="16"/>
+        </w:rPr>
+        <w:t xml:space="preserve">26      "Account" =&gt; [</w:t>
+      </w:r>
+    </w:p>
+    <w:p>
+      <w:pPr>
+        <w:pStyle w:val="Code"/>
+        <w:spacing w:before="0" w:after="0"/>
+        <w:ind w:left="552" w:hanging="352"/>
+      </w:pPr>
+      <w:r>
+        <w:rPr>
+          <w:rFonts w:ascii="Consolas" w:hAnsi="Consolas" w:cs="Consolas"/>
+          <w:sz w:val="16"/>
+          <w:szCs w:val="16"/>
+        </w:rPr>
+        <w:t xml:space="preserve">27          ["index.php",         "bi-house",            "Home Portal",   ["index.php"]],</w:t>
+      </w:r>
+    </w:p>
+    <w:p>
+      <w:pPr>
+        <w:pStyle w:val="Code"/>
+        <w:spacing w:before="0" w:after="0"/>
+        <w:ind w:left="552" w:hanging="352"/>
+      </w:pPr>
+      <w:r>
+        <w:rPr>
+          <w:rFonts w:ascii="Consolas" w:hAnsi="Consolas" w:cs="Consolas"/>
+          <w:sz w:val="16"/>
+          <w:szCs w:val="16"/>
+        </w:rPr>
+        <w:t xml:space="preserve">28          ["logout.php",        "bi-box-arrow-right",  "Logout",        []],</w:t>
+      </w:r>
+    </w:p>
+    <w:p>
+      <w:pPr>
+        <w:pStyle w:val="Code"/>
+        <w:spacing w:before="0" w:after="0"/>
+        <w:ind w:left="552" w:hanging="352"/>
+      </w:pPr>
+      <w:r>
+        <w:rPr>
+          <w:rFonts w:ascii="Consolas" w:hAnsi="Consolas" w:cs="Consolas"/>
+          <w:sz w:val="16"/>
+          <w:szCs w:val="16"/>
+        </w:rPr>
+        <w:t xml:space="preserve">29      ],</w:t>
+      </w:r>
+    </w:p>
+    <w:p>
+      <w:pPr>
+        <w:pStyle w:val="Code"/>
+        <w:spacing w:before="0" w:after="0"/>
+        <w:ind w:left="552" w:hanging="352"/>
+      </w:pPr>
+      <w:r>
+        <w:rPr>
+          <w:rFonts w:ascii="Consolas" w:hAnsi="Consolas" w:cs="Consolas"/>
+          <w:sz w:val="16"/>
+          <w:szCs w:val="16"/>
+        </w:rPr>
+        <w:t xml:space="preserve">30  ];</w:t>
+      </w:r>
+    </w:p>
+    <w:p>
+      <w:pPr>
+        <w:pStyle w:val="Code"/>
+        <w:spacing w:before="0" w:after="0"/>
+        <w:ind w:left="552" w:hanging="352"/>
+      </w:pPr>
+      <w:r>
+        <w:rPr>
+          <w:rFonts w:ascii="Consolas" w:hAnsi="Consolas" w:cs="Consolas"/>
+          <w:sz w:val="16"/>
+          <w:szCs w:val="16"/>
+        </w:rPr>
+        <w:t xml:space="preserve">31  ?&gt;</w:t>
+      </w:r>
+    </w:p>
+    <w:p>
+      <w:pPr>
+        <w:pStyle w:val="Code"/>
+        <w:spacing w:before="0" w:after="0"/>
+        <w:ind w:left="552" w:hanging="352"/>
+      </w:pPr>
+      <w:r>
+        <w:rPr>
+          <w:rFonts w:ascii="Consolas" w:hAnsi="Consolas" w:cs="Consolas"/>
+          <w:sz w:val="16"/>
+          <w:szCs w:val="16"/>
+        </w:rPr>
+        <w:t xml:space="preserve">32  &lt;a class="skip-link" href="#main-content"&gt;Skip to main content&lt;/a&gt;</w:t>
+      </w:r>
+    </w:p>
+    <w:p>
+      <w:pPr>
+        <w:spacing w:before="0" w:after="120"/>
+      </w:pPr>
+      <w:r>
+        <w:t xml:space="preserve"/>
+      </w:r>
+    </w:p>
+    <w:p>
+      <w:pPr>
+        <w:pStyle w:val="Code"/>
+        <w:spacing w:before="0" w:after="0"/>
+        <w:ind w:left="552" w:hanging="352"/>
+      </w:pPr>
+      <w:r>
+        <w:rPr>
+          <w:rFonts w:ascii="Consolas" w:hAnsi="Consolas" w:cs="Consolas"/>
+          <w:sz w:val="16"/>
+          <w:szCs w:val="16"/>
+        </w:rPr>
+        <w:t xml:space="preserve">67  &lt;?php foreach ($nav_groups as $group =&gt; $links): ?&gt;</w:t>
+      </w:r>
+    </w:p>
+    <w:p>
+      <w:pPr>
+        <w:pStyle w:val="Code"/>
+        <w:spacing w:before="0" w:after="0"/>
+        <w:ind w:left="552" w:hanging="352"/>
+      </w:pPr>
+      <w:r>
+        <w:rPr>
+          <w:rFonts w:ascii="Consolas" w:hAnsi="Consolas" w:cs="Consolas"/>
+          <w:sz w:val="16"/>
+          <w:szCs w:val="16"/>
+        </w:rPr>
+        <w:t xml:space="preserve">68      &lt;p class="nav-group-label"&gt;&lt;?= $group ?&gt;&lt;/p&gt;</w:t>
+      </w:r>
+    </w:p>
+    <w:p>
+      <w:pPr>
+        <w:pStyle w:val="Code"/>
+        <w:spacing w:before="0" w:after="0"/>
+        <w:ind w:left="552" w:hanging="352"/>
+      </w:pPr>
+      <w:r>
+        <w:rPr>
+          <w:rFonts w:ascii="Consolas" w:hAnsi="Consolas" w:cs="Consolas"/>
+          <w:sz w:val="16"/>
+          <w:szCs w:val="16"/>
+        </w:rPr>
+        <w:t xml:space="preserve">69      &lt;ul&gt;</w:t>
+      </w:r>
+    </w:p>
+    <w:p>
+      <w:pPr>
+        <w:pStyle w:val="Code"/>
+        <w:spacing w:before="0" w:after="0"/>
+        <w:ind w:left="552" w:hanging="352"/>
+      </w:pPr>
+      <w:r>
+        <w:rPr>
+          <w:rFonts w:ascii="Consolas" w:hAnsi="Consolas" w:cs="Consolas"/>
+          <w:sz w:val="16"/>
+          <w:szCs w:val="16"/>
+        </w:rPr>
+        <w:t xml:space="preserve">70          &lt;?php foreach ($links as [$href, $icon, $label, $active_pages]): ?&gt;</w:t>
+      </w:r>
+    </w:p>
+    <w:p>
+      <w:pPr>
+        <w:pStyle w:val="Code"/>
+        <w:spacing w:before="0" w:after="0"/>
+        <w:ind w:left="552" w:hanging="352"/>
+      </w:pPr>
+      <w:r>
+        <w:rPr>
+          <w:rFonts w:ascii="Consolas" w:hAnsi="Consolas" w:cs="Consolas"/>
+          <w:sz w:val="16"/>
+          <w:szCs w:val="16"/>
+        </w:rPr>
+        <w:t xml:space="preserve">71              &lt;?php $is_active = in_array($current_page, $active_pages, true); ?&gt;</w:t>
+      </w:r>
+    </w:p>
+    <w:p>
+      <w:pPr>
+        <w:pStyle w:val="Code"/>
+        <w:spacing w:before="0" w:after="0"/>
+        <w:ind w:left="552" w:hanging="352"/>
+      </w:pPr>
+      <w:r>
+        <w:rPr>
+          <w:rFonts w:ascii="Consolas" w:hAnsi="Consolas" w:cs="Consolas"/>
+          <w:sz w:val="16"/>
+          <w:szCs w:val="16"/>
+        </w:rPr>
+        <w:t xml:space="preserve">72              &lt;li&gt;&lt;a href="&lt;?= $href ?&gt;"&lt;?= $is_active ? ' class="active" aria-current="page"' : '' ?&gt;&gt;&lt;i class="bi &lt;?= $icon ?&gt;" aria-hidden="true"&gt;&lt;/i&gt;&lt;span&gt;&lt;?= $label ?&gt;&lt;/span&gt;&lt;/a&gt;&lt;/li&gt;</w:t>
+      </w:r>
+    </w:p>
+    <w:p>
+      <w:pPr>
+        <w:pStyle w:val="Code"/>
+        <w:spacing w:before="0" w:after="0"/>
+        <w:ind w:left="552" w:hanging="352"/>
+      </w:pPr>
+      <w:r>
+        <w:rPr>
+          <w:rFonts w:ascii="Consolas" w:hAnsi="Consolas" w:cs="Consolas"/>
+          <w:sz w:val="16"/>
+          <w:szCs w:val="16"/>
+        </w:rPr>
+        <w:t xml:space="preserve">73          &lt;?php endforeach; ?&gt;</w:t>
+      </w:r>
+    </w:p>
+    <w:p>
+      <w:pPr>
+        <w:pStyle w:val="Code"/>
+        <w:spacing w:before="0" w:after="0"/>
+        <w:ind w:left="552" w:hanging="352"/>
+      </w:pPr>
+      <w:r>
+        <w:rPr>
+          <w:rFonts w:ascii="Consolas" w:hAnsi="Consolas" w:cs="Consolas"/>
+          <w:sz w:val="16"/>
+          <w:szCs w:val="16"/>
+        </w:rPr>
+        <w:t xml:space="preserve">74          &lt;?php if ($group === "Account" &amp;&amp; $is_admin): ?&gt;</w:t>
+      </w:r>
+    </w:p>
+    <w:p>
+      <w:pPr>
+        <w:pStyle w:val="Code"/>
+        <w:spacing w:before="0" w:after="0"/>
+        <w:ind w:left="552" w:hanging="352"/>
+      </w:pPr>
+      <w:r>
+        <w:rPr>
+          <w:rFonts w:ascii="Consolas" w:hAnsi="Consolas" w:cs="Consolas"/>
+          <w:sz w:val="16"/>
+          <w:szCs w:val="16"/>
+        </w:rPr>
+        <w:t xml:space="preserve">75              &lt;li&gt;&lt;a href="admin_dashboard.php" class="nav-admin"&gt;&lt;i class="bi bi-shield-lock" aria-hidden="true"&gt;&lt;/i&gt;&lt;span&gt;Admin Console&lt;/span&gt;&lt;/a&gt;&lt;/li&gt;</w:t>
+      </w:r>
+    </w:p>
+    <w:p>
+      <w:pPr>
+        <w:pStyle w:val="Code"/>
+        <w:spacing w:before="0" w:after="0"/>
+        <w:ind w:left="552" w:hanging="352"/>
+      </w:pPr>
+      <w:r>
+        <w:rPr>
+          <w:rFonts w:ascii="Consolas" w:hAnsi="Consolas" w:cs="Consolas"/>
+          <w:sz w:val="16"/>
+          <w:szCs w:val="16"/>
+        </w:rPr>
+        <w:t xml:space="preserve">76          &lt;?php endif; ?&gt;</w:t>
+      </w:r>
+    </w:p>
+    <w:p>
+      <w:pPr>
+        <w:pStyle w:val="Code"/>
+        <w:spacing w:before="0" w:after="0"/>
+        <w:ind w:left="552" w:hanging="352"/>
+      </w:pPr>
+      <w:r>
+        <w:rPr>
+          <w:rFonts w:ascii="Consolas" w:hAnsi="Consolas" w:cs="Consolas"/>
+          <w:sz w:val="16"/>
+          <w:szCs w:val="16"/>
+        </w:rPr>
+        <w:t xml:space="preserve">77      &lt;/ul&gt;</w:t>
+      </w:r>
+    </w:p>
+    <w:p>
+      <w:pPr>
+        <w:pStyle w:val="Code"/>
+        <w:spacing w:before="0" w:after="0"/>
+        <w:ind w:left="552" w:hanging="352"/>
+      </w:pPr>
+      <w:r>
+        <w:rPr>
+          <w:rFonts w:ascii="Consolas" w:hAnsi="Consolas" w:cs="Consolas"/>
+          <w:sz w:val="16"/>
+          <w:szCs w:val="16"/>
+        </w:rPr>
+        <w:t xml:space="preserve">78  &lt;?php endforeach; ?&gt;</w:t>
+      </w:r>
+    </w:p>
+    <w:p>
+      <w:pPr>
+        <w:spacing w:before="0" w:after="120"/>
+      </w:pPr>
+      <w:r>
+        <w:t xml:space="preserve"/>
+      </w:r>
+    </w:p>
+    <w:p>
+      <w:pPr>
+        <w:pStyle w:val="ListParagraph"/>
+        <w:numPr>
+          <w:ilvl w:val="0"/>
+          <w:numId w:val="1"/>
+        </w:numPr>
+        <w:spacing w:before="0" w:after="60"/>
+      </w:pPr>
+      <w:r>
+        <w:rPr>
+          <w:b/>
+        </w:rPr>
+        <w:t xml:space="preserve">Single navigation map: </w:t>
+      </w:r>
+      <w:r>
+        <w:t xml:space="preserve">$nav_groups lists every signed-in page under Overview, Academics, Campus and Account – the same grouping as the sitemap in Figure 1.</w:t>
+      </w:r>
+    </w:p>
+    <w:p>
+      <w:pPr>
+        <w:pStyle w:val="ListParagraph"/>
+        <w:numPr>
+          <w:ilvl w:val="0"/>
+          <w:numId w:val="1"/>
+        </w:numPr>
+        <w:spacing w:before="0" w:after="60"/>
+      </w:pPr>
+      <w:r>
+        <w:rPr>
+          <w:b/>
+        </w:rPr>
+        <w:t xml:space="preserve">Rendering: </w:t>
+      </w:r>
+      <w:r>
+        <w:t xml:space="preserve">the loop prints each group, marks the current page with class="active" and aria-current="page", and adds the Admin Console link only when the session role is admin.</w:t>
+      </w:r>
+    </w:p>
+    <w:p>
+      <w:pPr>
+        <w:pStyle w:val="ListParagraph"/>
+        <w:numPr>
+          <w:ilvl w:val="0"/>
+          <w:numId w:val="1"/>
+        </w:numPr>
+        <w:spacing w:before="0" w:after="60"/>
+      </w:pPr>
+      <w:r>
+        <w:rPr>
+          <w:b/>
+        </w:rPr>
+        <w:t xml:space="preserve">Accessibility: </w:t>
+      </w:r>
+      <w:r>
+        <w:t xml:space="preserve">the skip link jumps to &lt;main id="main-content"&gt; on every signed-in page. The public home page (index.php) does not include a skip link.</w:t>
+      </w:r>
+    </w:p>
+    <w:p>
+      <w:pPr>
+        <w:pStyle w:val="ListParagraph"/>
+        <w:numPr>
+          <w:ilvl w:val="0"/>
+          <w:numId w:val="1"/>
+        </w:numPr>
+        <w:spacing w:before="0" w:after="60"/>
+      </w:pPr>
+      <w:r>
+        <w:rPr>
+          <w:b/>
+        </w:rPr>
+        <w:t xml:space="preserve">Reuse: </w:t>
+      </w:r>
+      <w:r>
+        <w:t xml:space="preserve">each signed-in page includes sidebar.php, so the menu is defined once.</w:t>
+      </w:r>
+    </w:p>
+    <w:p>
+      <w:pPr>
+        <w:pStyle w:val="Heading2"/>
+        <w:keepNext/>
+      </w:pPr>
+      <w:r>
+        <w:t xml:space="preserve">11.4 Screenshots from VS Code</w:t>
+      </w:r>
+    </w:p>
+    <w:tbl>
+      <w:tblPr>
+        <w:tblW w:w="9638" w:type="dxa"/>
+        <w:tblBorders>
+          <w:top w:val="dashed" w:sz="8" w:space="0" w:color="8A93AB"/>
+          <w:left w:val="dashed" w:sz="8" w:space="0" w:color="8A93AB"/>
+          <w:bottom w:val="dashed" w:sz="8" w:space="0" w:color="8A93AB"/>
+          <w:right w:val="dashed" w:sz="8" w:space="0" w:color="8A93AB"/>
+        </w:tblBorders>
+        <w:tblLayout w:type="fixed"/>
+      </w:tblPr>
+      <w:tblGrid>
+        <w:gridCol w:w="9638"/>
+      </w:tblGrid>
+      <w:tr>
+        <w:trPr>
+          <w:trHeight w:val="3000" w:hRule="exact"/>
+        </w:trPr>
+        <w:tc>
+          <w:tcPr>
+            <w:tcW w:w="9638" w:type="dxa"/>
+            <w:shd w:val="clear" w:color="auto" w:fill="F7F8FC"/>
+            <w:vAlign w:val="center"/>
+          </w:tcPr>
+          <w:p>
+            <w:pPr>
+              <w:spacing w:before="0" w:after="40"/>
+              <w:jc w:val="center"/>
+            </w:pPr>
+            <w:r>
+              <w:rPr>
+                <w:i/>
+                <w:color w:val="5B6478"/>
+              </w:rPr>
+              <w:t xml:space="preserve">Screenshot placeholder: VS Code – studenthub/index.php, lines 18–65</w:t>
+            </w:r>
+          </w:p>
+          <w:p>
+            <w:pPr>
+              <w:spacing w:before="0" w:after="0"/>
+              <w:jc w:val="center"/>
+            </w:pPr>
+            <w:r>
+              <w:rPr>
+                <w:i/>
+                <w:color w:val="5B6478"/>
+                <w:sz w:val="19"/>
+                <w:szCs w:val="19"/>
+              </w:rPr>
+              <w:t xml:space="preserve">Insert a screenshot of the file open in VS Code.</w:t>
+            </w:r>
+          </w:p>
+        </w:tc>
+      </w:tr>
+    </w:tbl>
+    <w:p>
+      <w:pPr>
+        <w:spacing w:before="0" w:after="120"/>
+      </w:pPr>
+      <w:r>
+        <w:t xml:space="preserve"/>
+      </w:r>
+    </w:p>
+    <w:tbl>
+      <w:tblPr>
+        <w:tblW w:w="9638" w:type="dxa"/>
+        <w:tblBorders>
+          <w:top w:val="dashed" w:sz="8" w:space="0" w:color="8A93AB"/>
+          <w:left w:val="dashed" w:sz="8" w:space="0" w:color="8A93AB"/>
+          <w:bottom w:val="dashed" w:sz="8" w:space="0" w:color="8A93AB"/>
+          <w:right w:val="dashed" w:sz="8" w:space="0" w:color="8A93AB"/>
+        </w:tblBorders>
+        <w:tblLayout w:type="fixed"/>
+      </w:tblPr>
+      <w:tblGrid>
+        <w:gridCol w:w="9638"/>
+      </w:tblGrid>
+      <w:tr>
+        <w:trPr>
+          <w:trHeight w:val="3000" w:hRule="exact"/>
+        </w:trPr>
+        <w:tc>
+          <w:tcPr>
+            <w:tcW w:w="9638" w:type="dxa"/>
+            <w:shd w:val="clear" w:color="auto" w:fill="F7F8FC"/>
+            <w:vAlign w:val="center"/>
+          </w:tcPr>
+          <w:p>
+            <w:pPr>
+              <w:spacing w:before="0" w:after="40"/>
+              <w:jc w:val="center"/>
+            </w:pPr>
+            <w:r>
+              <w:rPr>
+                <w:i/>
+                <w:color w:val="5B6478"/>
+              </w:rPr>
+              <w:t xml:space="preserve">Screenshot placeholder: VS Code – studenthub/sidebar.php, lines 8–32</w:t>
+            </w:r>
+          </w:p>
+          <w:p>
+            <w:pPr>
+              <w:spacing w:before="0" w:after="0"/>
+              <w:jc w:val="center"/>
+            </w:pPr>
+            <w:r>
+              <w:rPr>
+                <w:i/>
+                <w:color w:val="5B6478"/>
+                <w:sz w:val="19"/>
+                <w:szCs w:val="19"/>
+              </w:rPr>
+              <w:t xml:space="preserve">Insert a screenshot of the file open in VS Code.</w:t>
+            </w:r>
+          </w:p>
+        </w:tc>
+      </w:tr>
+    </w:tbl>
+    <w:p>
+      <w:pPr>
+        <w:spacing w:before="0" w:after="120"/>
+      </w:pPr>
+      <w:r>
+        <w:t xml:space="preserve"/>
+      </w:r>
+    </w:p>
+    <w:p>
+      <w:pPr>
+        <w:pStyle w:val="Heading1"/>
+        <w:keepNext/>
+      </w:pPr>
+      <w:r>
+        <w:t xml:space="preserve">12. GitHub Repository</w:t>
       </w:r>
     </w:p>
     <w:p>
@@ -3769,7 +5717,7 @@
                 <w:i/>
                 <w:color w:val="5B6478"/>
               </w:rPr>
-              <w:t xml:space="preserve">Screenshot placeholder: GitHub repository page</w:t>
+              <w:t xml:space="preserve">PLACEHOLDER – GitHub repository screenshot (genuine screenshot required)</w:t>
             </w:r>
           </w:p>
           <w:p>
@@ -3784,7 +5732,7 @@
                 <w:sz w:val="19"/>
                 <w:szCs w:val="19"/>
               </w:rPr>
-              <w:t xml:space="preserve">Insert a screenshot of the repository page after the files have been pushed.</w:t>
+              <w:t xml:space="preserve">Insert a screenshot of the repository page showing the uploaded project; save the same image as Practical-1/screenshots/github-repository.png.</w:t>
             </w:r>
           </w:p>
         </w:tc>
@@ -3804,7 +5752,7 @@
         <w:keepNext/>
       </w:pPr>
       <w:r>
-        <w:t xml:space="preserve">12. Tools &amp; Technologies</w:t>
+        <w:t xml:space="preserve">13. Tools &amp; Technologies</w:t>
       </w:r>
     </w:p>
     <w:tbl>
@@ -4139,7 +6087,458 @@
         <w:keepNext/>
       </w:pPr>
       <w:r>
-        <w:t xml:space="preserve">13. Conclusion</w:t>
+        <w:t xml:space="preserve">14. Submission Deliverables</w:t>
+      </w:r>
+    </w:p>
+    <w:p>
+      <w:pPr/>
+      <w:r>
+        <w:t xml:space="preserve">The deliverables required for Practical 1 and where each one is provided:</w:t>
+      </w:r>
+    </w:p>
+    <w:tbl>
+      <w:tblPr>
+        <w:tblW w:w="9638" w:type="dxa"/>
+        <w:tblBorders>
+          <w:top w:val="single" w:sz="4" w:space="0" w:color="B8BECC"/>
+          <w:left w:val="single" w:sz="4" w:space="0" w:color="B8BECC"/>
+          <w:bottom w:val="single" w:sz="4" w:space="0" w:color="B8BECC"/>
+          <w:right w:val="single" w:sz="4" w:space="0" w:color="B8BECC"/>
+          <w:insideH w:val="single" w:sz="4" w:space="0" w:color="B8BECC"/>
+          <w:insideV w:val="single" w:sz="4" w:space="0" w:color="B8BECC"/>
+        </w:tblBorders>
+        <w:tblLayout w:type="fixed"/>
+        <w:tblCellMar>
+          <w:top w:w="60" w:type="dxa"/>
+          <w:left w:w="100" w:type="dxa"/>
+          <w:bottom w:w="60" w:type="dxa"/>
+          <w:right w:w="100" w:type="dxa"/>
+        </w:tblCellMar>
+      </w:tblPr>
+      <w:tblGrid>
+        <w:gridCol w:w="500"/>
+        <w:gridCol w:w="3000"/>
+        <w:gridCol w:w="6138"/>
+      </w:tblGrid>
+      <w:tr>
+        <w:trPr>
+          <w:tblHeader/>
+          <w:cantSplit/>
+        </w:trPr>
+        <w:tc>
+          <w:tcPr>
+            <w:tcW w:w="500" w:type="dxa"/>
+            <w:shd w:val="clear" w:color="auto" w:fill="1F2A5C"/>
+          </w:tcPr>
+          <w:p>
+            <w:pPr>
+              <w:spacing w:before="0" w:after="0"/>
+              <w:jc w:val="left"/>
+            </w:pPr>
+            <w:r>
+              <w:rPr>
+                <w:b/>
+                <w:color w:val="FFFFFF"/>
+                <w:sz w:val="20"/>
+                <w:szCs w:val="20"/>
+              </w:rPr>
+              <w:t xml:space="preserve">#</w:t>
+            </w:r>
+          </w:p>
+        </w:tc>
+        <w:tc>
+          <w:tcPr>
+            <w:tcW w:w="3000" w:type="dxa"/>
+            <w:shd w:val="clear" w:color="auto" w:fill="1F2A5C"/>
+          </w:tcPr>
+          <w:p>
+            <w:pPr>
+              <w:spacing w:before="0" w:after="0"/>
+              <w:jc w:val="left"/>
+            </w:pPr>
+            <w:r>
+              <w:rPr>
+                <w:b/>
+                <w:color w:val="FFFFFF"/>
+                <w:sz w:val="20"/>
+                <w:szCs w:val="20"/>
+              </w:rPr>
+              <w:t xml:space="preserve">Deliverable</w:t>
+            </w:r>
+          </w:p>
+        </w:tc>
+        <w:tc>
+          <w:tcPr>
+            <w:tcW w:w="6138" w:type="dxa"/>
+            <w:shd w:val="clear" w:color="auto" w:fill="1F2A5C"/>
+          </w:tcPr>
+          <w:p>
+            <w:pPr>
+              <w:spacing w:before="0" w:after="0"/>
+              <w:jc w:val="left"/>
+            </w:pPr>
+            <w:r>
+              <w:rPr>
+                <w:b/>
+                <w:color w:val="FFFFFF"/>
+                <w:sz w:val="20"/>
+                <w:szCs w:val="20"/>
+              </w:rPr>
+              <w:t xml:space="preserve">Provided as</w:t>
+            </w:r>
+          </w:p>
+        </w:tc>
+      </w:tr>
+      <w:tr>
+        <w:trPr>
+          <w:cantSplit/>
+        </w:trPr>
+        <w:tc>
+          <w:tcPr>
+            <w:tcW w:w="500" w:type="dxa"/>
+          </w:tcPr>
+          <w:p>
+            <w:pPr>
+              <w:spacing w:before="0" w:after="0"/>
+              <w:jc w:val="left"/>
+            </w:pPr>
+            <w:r>
+              <w:rPr>
+                <w:sz w:val="20"/>
+                <w:szCs w:val="20"/>
+              </w:rPr>
+              <w:t xml:space="preserve">1</w:t>
+            </w:r>
+          </w:p>
+        </w:tc>
+        <w:tc>
+          <w:tcPr>
+            <w:tcW w:w="3000" w:type="dxa"/>
+          </w:tcPr>
+          <w:p>
+            <w:pPr>
+              <w:spacing w:before="0" w:after="0"/>
+              <w:jc w:val="left"/>
+            </w:pPr>
+            <w:r>
+              <w:rPr>
+                <w:sz w:val="20"/>
+                <w:szCs w:val="20"/>
+              </w:rPr>
+              <w:t xml:space="preserve">Complete StudentHub project folder</w:t>
+            </w:r>
+          </w:p>
+        </w:tc>
+        <w:tc>
+          <w:tcPr>
+            <w:tcW w:w="6138" w:type="dxa"/>
+          </w:tcPr>
+          <w:p>
+            <w:pPr>
+              <w:spacing w:before="0" w:after="0"/>
+              <w:jc w:val="left"/>
+            </w:pPr>
+            <w:r>
+              <w:rPr>
+                <w:sz w:val="20"/>
+                <w:szCs w:val="20"/>
+              </w:rPr>
+              <w:t xml:space="preserve">The whole repository: studenthub/ (main application), Practical-1 to Practical-15, database/, tools/, README.md</w:t>
+            </w:r>
+          </w:p>
+        </w:tc>
+      </w:tr>
+      <w:tr>
+        <w:trPr>
+          <w:cantSplit/>
+        </w:trPr>
+        <w:tc>
+          <w:tcPr>
+            <w:tcW w:w="500" w:type="dxa"/>
+          </w:tcPr>
+          <w:p>
+            <w:pPr>
+              <w:spacing w:before="0" w:after="0"/>
+              <w:jc w:val="left"/>
+            </w:pPr>
+            <w:r>
+              <w:rPr>
+                <w:sz w:val="20"/>
+                <w:szCs w:val="20"/>
+              </w:rPr>
+              <w:t xml:space="preserve">2</w:t>
+            </w:r>
+          </w:p>
+        </w:tc>
+        <w:tc>
+          <w:tcPr>
+            <w:tcW w:w="3000" w:type="dxa"/>
+          </w:tcPr>
+          <w:p>
+            <w:pPr>
+              <w:spacing w:before="0" w:after="0"/>
+              <w:jc w:val="left"/>
+            </w:pPr>
+            <w:r>
+              <w:rPr>
+                <w:sz w:val="20"/>
+                <w:szCs w:val="20"/>
+              </w:rPr>
+              <w:t xml:space="preserve">GitHub repository screenshot</w:t>
+            </w:r>
+          </w:p>
+        </w:tc>
+        <w:tc>
+          <w:tcPr>
+            <w:tcW w:w="6138" w:type="dxa"/>
+          </w:tcPr>
+          <w:p>
+            <w:pPr>
+              <w:spacing w:before="0" w:after="0"/>
+              <w:jc w:val="left"/>
+            </w:pPr>
+            <w:r>
+              <w:rPr>
+                <w:sz w:val="20"/>
+                <w:szCs w:val="20"/>
+              </w:rPr>
+              <w:t xml:space="preserve">Section 12 of this report</w:t>
+            </w:r>
+          </w:p>
+          <w:p>
+            <w:pPr>
+              <w:spacing w:before="0" w:after="0"/>
+              <w:jc w:val="left"/>
+            </w:pPr>
+            <w:r>
+              <w:rPr>
+                <w:sz w:val="20"/>
+                <w:szCs w:val="20"/>
+              </w:rPr>
+              <w:t xml:space="preserve">Practical-1/screenshots/github-repository.png</w:t>
+            </w:r>
+          </w:p>
+        </w:tc>
+      </w:tr>
+      <w:tr>
+        <w:trPr>
+          <w:cantSplit/>
+        </w:trPr>
+        <w:tc>
+          <w:tcPr>
+            <w:tcW w:w="500" w:type="dxa"/>
+          </w:tcPr>
+          <w:p>
+            <w:pPr>
+              <w:spacing w:before="0" w:after="0"/>
+              <w:jc w:val="left"/>
+            </w:pPr>
+            <w:r>
+              <w:rPr>
+                <w:sz w:val="20"/>
+                <w:szCs w:val="20"/>
+              </w:rPr>
+              <w:t xml:space="preserve">3</w:t>
+            </w:r>
+          </w:p>
+        </w:tc>
+        <w:tc>
+          <w:tcPr>
+            <w:tcW w:w="3000" w:type="dxa"/>
+          </w:tcPr>
+          <w:p>
+            <w:pPr>
+              <w:spacing w:before="0" w:after="0"/>
+              <w:jc w:val="left"/>
+            </w:pPr>
+            <w:r>
+              <w:rPr>
+                <w:sz w:val="20"/>
+                <w:szCs w:val="20"/>
+              </w:rPr>
+              <w:t xml:space="preserve">GitHub repository link</w:t>
+            </w:r>
+          </w:p>
+        </w:tc>
+        <w:tc>
+          <w:tcPr>
+            <w:tcW w:w="6138" w:type="dxa"/>
+          </w:tcPr>
+          <w:p>
+            <w:pPr>
+              <w:spacing w:before="0" w:after="0"/>
+              <w:jc w:val="left"/>
+            </w:pPr>
+            <w:r>
+              <w:rPr>
+                <w:sz w:val="20"/>
+                <w:szCs w:val="20"/>
+              </w:rPr>
+              <w:t xml:space="preserve">https://github.com/TheEmperor08/StudentHub-ITUE203-25CS023</w:t>
+            </w:r>
+          </w:p>
+        </w:tc>
+      </w:tr>
+      <w:tr>
+        <w:trPr>
+          <w:cantSplit/>
+        </w:trPr>
+        <w:tc>
+          <w:tcPr>
+            <w:tcW w:w="500" w:type="dxa"/>
+          </w:tcPr>
+          <w:p>
+            <w:pPr>
+              <w:spacing w:before="0" w:after="0"/>
+              <w:jc w:val="left"/>
+            </w:pPr>
+            <w:r>
+              <w:rPr>
+                <w:sz w:val="20"/>
+                <w:szCs w:val="20"/>
+              </w:rPr>
+              <w:t xml:space="preserve">4</w:t>
+            </w:r>
+          </w:p>
+        </w:tc>
+        <w:tc>
+          <w:tcPr>
+            <w:tcW w:w="3000" w:type="dxa"/>
+          </w:tcPr>
+          <w:p>
+            <w:pPr>
+              <w:spacing w:before="0" w:after="0"/>
+              <w:jc w:val="left"/>
+            </w:pPr>
+            <w:r>
+              <w:rPr>
+                <w:sz w:val="20"/>
+                <w:szCs w:val="20"/>
+              </w:rPr>
+              <w:t xml:space="preserve">Sitemap PDF</w:t>
+            </w:r>
+          </w:p>
+        </w:tc>
+        <w:tc>
+          <w:tcPr>
+            <w:tcW w:w="6138" w:type="dxa"/>
+          </w:tcPr>
+          <w:p>
+            <w:pPr>
+              <w:spacing w:before="0" w:after="0"/>
+              <w:jc w:val="left"/>
+            </w:pPr>
+            <w:r>
+              <w:rPr>
+                <w:sz w:val="20"/>
+                <w:szCs w:val="20"/>
+              </w:rPr>
+              <w:t xml:space="preserve">Practical-1/PRAC_1_Sitemap_25CS023.pdf</w:t>
+            </w:r>
+          </w:p>
+          <w:p>
+            <w:pPr>
+              <w:spacing w:before="0" w:after="0"/>
+              <w:jc w:val="left"/>
+            </w:pPr>
+            <w:r>
+              <w:rPr>
+                <w:sz w:val="20"/>
+                <w:szCs w:val="20"/>
+              </w:rPr>
+              <w:t xml:space="preserve">1 page, A4 landscape (Figure 1)</w:t>
+            </w:r>
+          </w:p>
+        </w:tc>
+      </w:tr>
+      <w:tr>
+        <w:trPr>
+          <w:cantSplit/>
+        </w:trPr>
+        <w:tc>
+          <w:tcPr>
+            <w:tcW w:w="500" w:type="dxa"/>
+          </w:tcPr>
+          <w:p>
+            <w:pPr>
+              <w:spacing w:before="0" w:after="0"/>
+              <w:jc w:val="left"/>
+            </w:pPr>
+            <w:r>
+              <w:rPr>
+                <w:sz w:val="20"/>
+                <w:szCs w:val="20"/>
+              </w:rPr>
+              <w:t xml:space="preserve">5</w:t>
+            </w:r>
+          </w:p>
+        </w:tc>
+        <w:tc>
+          <w:tcPr>
+            <w:tcW w:w="3000" w:type="dxa"/>
+          </w:tcPr>
+          <w:p>
+            <w:pPr>
+              <w:spacing w:before="0" w:after="0"/>
+              <w:jc w:val="left"/>
+            </w:pPr>
+            <w:r>
+              <w:rPr>
+                <w:sz w:val="20"/>
+                <w:szCs w:val="20"/>
+              </w:rPr>
+              <w:t xml:space="preserve">Low-fidelity wireframe PDF</w:t>
+            </w:r>
+          </w:p>
+        </w:tc>
+        <w:tc>
+          <w:tcPr>
+            <w:tcW w:w="6138" w:type="dxa"/>
+          </w:tcPr>
+          <w:p>
+            <w:pPr>
+              <w:spacing w:before="0" w:after="0"/>
+              <w:jc w:val="left"/>
+            </w:pPr>
+            <w:r>
+              <w:rPr>
+                <w:sz w:val="20"/>
+                <w:szCs w:val="20"/>
+              </w:rPr>
+              <w:t xml:space="preserve">Practical-1/PRAC_1_Wireframes_25CS023.pdf</w:t>
+            </w:r>
+          </w:p>
+          <w:p>
+            <w:pPr>
+              <w:spacing w:before="0" w:after="0"/>
+              <w:jc w:val="left"/>
+            </w:pPr>
+            <w:r>
+              <w:rPr>
+                <w:sz w:val="20"/>
+                <w:szCs w:val="20"/>
+              </w:rPr>
+              <w:t xml:space="preserve">3 pages, A4 landscape: student dashboard (desktop), home page and login (desktop), mobile screens (Figures 2–4)</w:t>
+            </w:r>
+          </w:p>
+        </w:tc>
+      </w:tr>
+    </w:tbl>
+    <w:p>
+      <w:pPr>
+        <w:spacing w:before="0" w:after="120"/>
+      </w:pPr>
+      <w:r>
+        <w:t xml:space="preserve"/>
+      </w:r>
+    </w:p>
+    <w:p>
+      <w:pPr>
+        <w:pStyle w:val="Heading1"/>
+        <w:keepNext/>
+      </w:pPr>
+      <w:r>
+        <w:t xml:space="preserve">15. Conclusion</w:t>
       </w:r>
     </w:p>
     <w:p>

</xml_diff>

<commit_message>
Complete Practicals 1-3 for ITUE203
Co-Authored-By: Claude Opus 5.5 <noreply@anthropic.com>
</commit_message>
<xml_diff>
--- a/Practical-1/PRAC_1_ITUE203_25CS023.docx
+++ b/Practical-1/PRAC_1_ITUE203_25CS023.docx
@@ -118,6 +118,7 @@
           </w:tcPr>
           <w:p>
             <w:pPr>
+              <w:keepNext/>
               <w:spacing w:before="0" w:after="0"/>
               <w:jc w:val="left"/>
             </w:pPr>
@@ -137,6 +138,7 @@
           </w:tcPr>
           <w:p>
             <w:pPr>
+              <w:keepNext/>
               <w:spacing w:before="0" w:after="0"/>
               <w:jc w:val="left"/>
             </w:pPr>
@@ -161,6 +163,7 @@
           </w:tcPr>
           <w:p>
             <w:pPr>
+              <w:keepNext/>
               <w:spacing w:before="0" w:after="0"/>
               <w:jc w:val="left"/>
             </w:pPr>
@@ -180,6 +183,7 @@
           </w:tcPr>
           <w:p>
             <w:pPr>
+              <w:keepNext/>
               <w:spacing w:before="0" w:after="0"/>
               <w:jc w:val="left"/>
             </w:pPr>
@@ -204,6 +208,7 @@
           </w:tcPr>
           <w:p>
             <w:pPr>
+              <w:keepNext/>
               <w:spacing w:before="0" w:after="0"/>
               <w:jc w:val="left"/>
             </w:pPr>
@@ -223,6 +228,7 @@
           </w:tcPr>
           <w:p>
             <w:pPr>
+              <w:keepNext/>
               <w:spacing w:before="0" w:after="0"/>
               <w:jc w:val="left"/>
             </w:pPr>
@@ -247,6 +253,7 @@
           </w:tcPr>
           <w:p>
             <w:pPr>
+              <w:keepNext/>
               <w:spacing w:before="0" w:after="0"/>
               <w:jc w:val="left"/>
             </w:pPr>
@@ -266,6 +273,7 @@
           </w:tcPr>
           <w:p>
             <w:pPr>
+              <w:keepNext/>
               <w:spacing w:before="0" w:after="0"/>
               <w:jc w:val="left"/>
             </w:pPr>
@@ -290,6 +298,7 @@
           </w:tcPr>
           <w:p>
             <w:pPr>
+              <w:keepNext/>
               <w:spacing w:before="0" w:after="0"/>
               <w:jc w:val="left"/>
             </w:pPr>
@@ -309,6 +318,7 @@
           </w:tcPr>
           <w:p>
             <w:pPr>
+              <w:keepNext/>
               <w:spacing w:before="0" w:after="0"/>
               <w:jc w:val="left"/>
             </w:pPr>
@@ -333,6 +343,7 @@
           </w:tcPr>
           <w:p>
             <w:pPr>
+              <w:keepNext/>
               <w:spacing w:before="0" w:after="0"/>
               <w:jc w:val="left"/>
             </w:pPr>
@@ -352,6 +363,7 @@
           </w:tcPr>
           <w:p>
             <w:pPr>
+              <w:keepNext/>
               <w:spacing w:before="0" w:after="0"/>
               <w:jc w:val="left"/>
             </w:pPr>
@@ -714,6 +726,7 @@
           </w:tcPr>
           <w:p>
             <w:pPr>
+              <w:keepNext/>
               <w:spacing w:before="0" w:after="0"/>
               <w:jc w:val="left"/>
             </w:pPr>
@@ -735,6 +748,7 @@
           </w:tcPr>
           <w:p>
             <w:pPr>
+              <w:keepNext/>
               <w:spacing w:before="0" w:after="0"/>
               <w:jc w:val="left"/>
             </w:pPr>
@@ -756,6 +770,7 @@
           </w:tcPr>
           <w:p>
             <w:pPr>
+              <w:keepNext/>
               <w:spacing w:before="0" w:after="0"/>
               <w:jc w:val="left"/>
             </w:pPr>
@@ -781,6 +796,7 @@
           </w:tcPr>
           <w:p>
             <w:pPr>
+              <w:keepNext/>
               <w:spacing w:before="0" w:after="0"/>
               <w:jc w:val="left"/>
             </w:pPr>
@@ -799,6 +815,7 @@
           </w:tcPr>
           <w:p>
             <w:pPr>
+              <w:keepNext/>
               <w:spacing w:before="0" w:after="0"/>
               <w:jc w:val="left"/>
             </w:pPr>
@@ -817,6 +834,7 @@
           </w:tcPr>
           <w:p>
             <w:pPr>
+              <w:keepNext/>
               <w:spacing w:before="0" w:after="0"/>
               <w:jc w:val="left"/>
             </w:pPr>
@@ -840,6 +858,7 @@
           </w:tcPr>
           <w:p>
             <w:pPr>
+              <w:keepNext/>
               <w:spacing w:before="0" w:after="0"/>
               <w:jc w:val="left"/>
             </w:pPr>
@@ -858,6 +877,7 @@
           </w:tcPr>
           <w:p>
             <w:pPr>
+              <w:keepNext/>
               <w:spacing w:before="0" w:after="0"/>
               <w:jc w:val="left"/>
             </w:pPr>
@@ -876,6 +896,7 @@
           </w:tcPr>
           <w:p>
             <w:pPr>
+              <w:keepNext/>
               <w:spacing w:before="0" w:after="0"/>
               <w:jc w:val="left"/>
             </w:pPr>
@@ -899,6 +920,7 @@
           </w:tcPr>
           <w:p>
             <w:pPr>
+              <w:keepNext/>
               <w:spacing w:before="0" w:after="0"/>
               <w:jc w:val="left"/>
             </w:pPr>
@@ -917,6 +939,7 @@
           </w:tcPr>
           <w:p>
             <w:pPr>
+              <w:keepNext/>
               <w:spacing w:before="0" w:after="0"/>
               <w:jc w:val="left"/>
             </w:pPr>
@@ -935,6 +958,7 @@
           </w:tcPr>
           <w:p>
             <w:pPr>
+              <w:keepNext/>
               <w:spacing w:before="0" w:after="0"/>
               <w:jc w:val="left"/>
             </w:pPr>
@@ -1061,6 +1085,7 @@
           </w:tcPr>
           <w:p>
             <w:pPr>
+              <w:keepNext/>
               <w:spacing w:before="0" w:after="0"/>
               <w:jc w:val="left"/>
             </w:pPr>
@@ -1082,6 +1107,7 @@
           </w:tcPr>
           <w:p>
             <w:pPr>
+              <w:keepNext/>
               <w:spacing w:before="0" w:after="0"/>
               <w:jc w:val="left"/>
             </w:pPr>
@@ -1103,6 +1129,7 @@
           </w:tcPr>
           <w:p>
             <w:pPr>
+              <w:keepNext/>
               <w:spacing w:before="0" w:after="0"/>
               <w:jc w:val="left"/>
             </w:pPr>
@@ -1128,6 +1155,7 @@
           </w:tcPr>
           <w:p>
             <w:pPr>
+              <w:keepNext/>
               <w:spacing w:before="0" w:after="0"/>
               <w:jc w:val="left"/>
             </w:pPr>
@@ -1146,6 +1174,7 @@
           </w:tcPr>
           <w:p>
             <w:pPr>
+              <w:keepNext/>
               <w:spacing w:before="0" w:after="0"/>
               <w:jc w:val="left"/>
             </w:pPr>
@@ -1164,6 +1193,7 @@
           </w:tcPr>
           <w:p>
             <w:pPr>
+              <w:keepNext/>
               <w:spacing w:before="0" w:after="0"/>
               <w:jc w:val="left"/>
             </w:pPr>
@@ -1187,6 +1217,7 @@
           </w:tcPr>
           <w:p>
             <w:pPr>
+              <w:keepNext/>
               <w:spacing w:before="0" w:after="0"/>
               <w:jc w:val="left"/>
             </w:pPr>
@@ -1205,6 +1236,7 @@
           </w:tcPr>
           <w:p>
             <w:pPr>
+              <w:keepNext/>
               <w:spacing w:before="0" w:after="0"/>
               <w:jc w:val="left"/>
             </w:pPr>
@@ -1223,6 +1255,7 @@
           </w:tcPr>
           <w:p>
             <w:pPr>
+              <w:keepNext/>
               <w:spacing w:before="0" w:after="0"/>
               <w:jc w:val="left"/>
             </w:pPr>
@@ -1246,6 +1279,7 @@
           </w:tcPr>
           <w:p>
             <w:pPr>
+              <w:keepNext/>
               <w:spacing w:before="0" w:after="0"/>
               <w:jc w:val="left"/>
             </w:pPr>
@@ -1264,6 +1298,7 @@
           </w:tcPr>
           <w:p>
             <w:pPr>
+              <w:keepNext/>
               <w:spacing w:before="0" w:after="0"/>
               <w:jc w:val="left"/>
             </w:pPr>
@@ -1282,6 +1317,7 @@
           </w:tcPr>
           <w:p>
             <w:pPr>
+              <w:keepNext/>
               <w:spacing w:before="0" w:after="0"/>
               <w:jc w:val="left"/>
             </w:pPr>
@@ -1305,6 +1341,7 @@
           </w:tcPr>
           <w:p>
             <w:pPr>
+              <w:keepNext/>
               <w:spacing w:before="0" w:after="0"/>
               <w:jc w:val="left"/>
             </w:pPr>
@@ -1323,6 +1360,7 @@
           </w:tcPr>
           <w:p>
             <w:pPr>
+              <w:keepNext/>
               <w:spacing w:before="0" w:after="0"/>
               <w:jc w:val="left"/>
             </w:pPr>
@@ -1341,6 +1379,7 @@
           </w:tcPr>
           <w:p>
             <w:pPr>
+              <w:keepNext/>
               <w:spacing w:before="0" w:after="0"/>
               <w:jc w:val="left"/>
             </w:pPr>
@@ -1364,6 +1403,7 @@
           </w:tcPr>
           <w:p>
             <w:pPr>
+              <w:keepNext/>
               <w:spacing w:before="0" w:after="0"/>
               <w:jc w:val="left"/>
             </w:pPr>
@@ -1382,6 +1422,7 @@
           </w:tcPr>
           <w:p>
             <w:pPr>
+              <w:keepNext/>
               <w:spacing w:before="0" w:after="0"/>
               <w:jc w:val="left"/>
             </w:pPr>
@@ -1400,6 +1441,7 @@
           </w:tcPr>
           <w:p>
             <w:pPr>
+              <w:keepNext/>
               <w:spacing w:before="0" w:after="0"/>
               <w:jc w:val="left"/>
             </w:pPr>
@@ -1423,6 +1465,7 @@
           </w:tcPr>
           <w:p>
             <w:pPr>
+              <w:keepNext/>
               <w:spacing w:before="0" w:after="0"/>
               <w:jc w:val="left"/>
             </w:pPr>
@@ -1441,6 +1484,7 @@
           </w:tcPr>
           <w:p>
             <w:pPr>
+              <w:keepNext/>
               <w:spacing w:before="0" w:after="0"/>
               <w:jc w:val="left"/>
             </w:pPr>
@@ -1459,6 +1503,7 @@
           </w:tcPr>
           <w:p>
             <w:pPr>
+              <w:keepNext/>
               <w:spacing w:before="0" w:after="0"/>
               <w:jc w:val="left"/>
             </w:pPr>
@@ -1482,6 +1527,7 @@
           </w:tcPr>
           <w:p>
             <w:pPr>
+              <w:keepNext/>
               <w:spacing w:before="0" w:after="0"/>
               <w:jc w:val="left"/>
             </w:pPr>
@@ -1500,6 +1546,7 @@
           </w:tcPr>
           <w:p>
             <w:pPr>
+              <w:keepNext/>
               <w:spacing w:before="0" w:after="0"/>
               <w:jc w:val="left"/>
             </w:pPr>
@@ -1518,6 +1565,7 @@
           </w:tcPr>
           <w:p>
             <w:pPr>
+              <w:keepNext/>
               <w:spacing w:before="0" w:after="0"/>
               <w:jc w:val="left"/>
             </w:pPr>
@@ -3716,7 +3764,7 @@
           <w:sz w:val="18"/>
           <w:szCs w:val="18"/>
         </w:rPr>
-        <w:t xml:space="preserve">├── screenshots/                     (GitHub repository screenshot)</w:t>
+        <w:t xml:space="preserve">├── PRAC_1_ITUE203_25CS023.pdf       (PDF copy of this report)</w:t>
       </w:r>
     </w:p>
     <w:p>
@@ -3730,6 +3778,20 @@
           <w:sz w:val="18"/>
           <w:szCs w:val="18"/>
         </w:rPr>
+        <w:t xml:space="preserve">├── screenshots/                     (GitHub screenshot – to be added)</w:t>
+      </w:r>
+    </w:p>
+    <w:p>
+      <w:pPr>
+        <w:pStyle w:val="Code"/>
+        <w:spacing w:before="0" w:after="0"/>
+      </w:pPr>
+      <w:r>
+        <w:rPr>
+          <w:rFonts w:ascii="Consolas" w:hAnsi="Consolas" w:cs="Consolas"/>
+          <w:sz w:val="18"/>
+          <w:szCs w:val="18"/>
+        </w:rPr>
         <w:t xml:space="preserve">└── source/build_diagrams.py, export_pdfs.py</w:t>
       </w:r>
     </w:p>
@@ -3768,7 +3830,7 @@
     <w:p>
       <w:pPr/>
       <w:r>
-        <w:t xml:space="preserve">The excerpts below are copied unchanged from the StudentHub application in the repository (studenthub/ folder; Practical-15 holds an identical copy). Line numbers match the files; only the common leading indentation is removed. They show how the planned page structure and navigation flow are implemented.</w:t>
+        <w:t xml:space="preserve">The excerpts below are copied unchanged from the StudentHub application in the repository (studenthub/ folder; Practical-15 holds an identical copy). Line numbers match the files; only the common leading indentation is removed. They show how the planned page structure and navigation flow are implemented. Practical 1 is a planning practical: source code is not one of its required deliverables, so this section is supporting evidence only.</w:t>
       </w:r>
     </w:p>
     <w:tbl>
@@ -3807,6 +3869,7 @@
           </w:tcPr>
           <w:p>
             <w:pPr>
+              <w:keepNext/>
               <w:spacing w:before="0" w:after="0"/>
               <w:jc w:val="left"/>
             </w:pPr>
@@ -3828,6 +3891,7 @@
           </w:tcPr>
           <w:p>
             <w:pPr>
+              <w:keepNext/>
               <w:spacing w:before="0" w:after="0"/>
               <w:jc w:val="left"/>
             </w:pPr>
@@ -3849,6 +3913,7 @@
           </w:tcPr>
           <w:p>
             <w:pPr>
+              <w:keepNext/>
               <w:spacing w:before="0" w:after="0"/>
               <w:jc w:val="left"/>
             </w:pPr>
@@ -3874,6 +3939,7 @@
           </w:tcPr>
           <w:p>
             <w:pPr>
+              <w:keepNext/>
               <w:spacing w:before="0" w:after="0"/>
               <w:jc w:val="left"/>
             </w:pPr>
@@ -3892,6 +3958,7 @@
           </w:tcPr>
           <w:p>
             <w:pPr>
+              <w:keepNext/>
               <w:spacing w:before="0" w:after="0"/>
               <w:jc w:val="left"/>
             </w:pPr>
@@ -3910,6 +3977,7 @@
           </w:tcPr>
           <w:p>
             <w:pPr>
+              <w:keepNext/>
               <w:spacing w:before="0" w:after="0"/>
               <w:jc w:val="left"/>
             </w:pPr>
@@ -3933,6 +4001,7 @@
           </w:tcPr>
           <w:p>
             <w:pPr>
+              <w:keepNext/>
               <w:spacing w:before="0" w:after="0"/>
               <w:jc w:val="left"/>
             </w:pPr>
@@ -3951,6 +4020,7 @@
           </w:tcPr>
           <w:p>
             <w:pPr>
+              <w:keepNext/>
               <w:spacing w:before="0" w:after="0"/>
               <w:jc w:val="left"/>
             </w:pPr>
@@ -3969,6 +4039,7 @@
           </w:tcPr>
           <w:p>
             <w:pPr>
+              <w:keepNext/>
               <w:spacing w:before="0" w:after="0"/>
               <w:jc w:val="left"/>
             </w:pPr>
@@ -3992,6 +4063,7 @@
           </w:tcPr>
           <w:p>
             <w:pPr>
+              <w:keepNext/>
               <w:spacing w:before="0" w:after="0"/>
               <w:jc w:val="left"/>
             </w:pPr>
@@ -4010,6 +4082,7 @@
           </w:tcPr>
           <w:p>
             <w:pPr>
+              <w:keepNext/>
               <w:spacing w:before="0" w:after="0"/>
               <w:jc w:val="left"/>
             </w:pPr>
@@ -4028,6 +4101,7 @@
           </w:tcPr>
           <w:p>
             <w:pPr>
+              <w:keepNext/>
               <w:spacing w:before="0" w:after="0"/>
               <w:jc w:val="left"/>
             </w:pPr>
@@ -4121,6 +4195,7 @@
     <w:p>
       <w:pPr>
         <w:pStyle w:val="Code"/>
+        <w:keepNext/>
         <w:spacing w:before="0" w:after="0"/>
         <w:ind w:left="552" w:hanging="352"/>
       </w:pPr>
@@ -4136,6 +4211,7 @@
     <w:p>
       <w:pPr>
         <w:pStyle w:val="Code"/>
+        <w:keepNext/>
         <w:spacing w:before="0" w:after="0"/>
         <w:ind w:left="552" w:hanging="352"/>
       </w:pPr>
@@ -4151,6 +4227,7 @@
     <w:p>
       <w:pPr>
         <w:pStyle w:val="Code"/>
+        <w:keepNext/>
         <w:spacing w:before="0" w:after="0"/>
         <w:ind w:left="552" w:hanging="352"/>
       </w:pPr>
@@ -4166,6 +4243,7 @@
     <w:p>
       <w:pPr>
         <w:pStyle w:val="Code"/>
+        <w:keepNext/>
         <w:spacing w:before="0" w:after="0"/>
         <w:ind w:left="552" w:hanging="352"/>
       </w:pPr>
@@ -4181,6 +4259,7 @@
     <w:p>
       <w:pPr>
         <w:pStyle w:val="Code"/>
+        <w:keepNext/>
         <w:spacing w:before="0" w:after="0"/>
         <w:ind w:left="552" w:hanging="352"/>
       </w:pPr>
@@ -4196,6 +4275,7 @@
     <w:p>
       <w:pPr>
         <w:pStyle w:val="Code"/>
+        <w:keepNext/>
         <w:spacing w:before="0" w:after="0"/>
         <w:ind w:left="552" w:hanging="352"/>
       </w:pPr>
@@ -4211,6 +4291,7 @@
     <w:p>
       <w:pPr>
         <w:pStyle w:val="Code"/>
+        <w:keepNext/>
         <w:spacing w:before="0" w:after="0"/>
         <w:ind w:left="552" w:hanging="352"/>
       </w:pPr>
@@ -4226,6 +4307,7 @@
     <w:p>
       <w:pPr>
         <w:pStyle w:val="Code"/>
+        <w:keepNext/>
         <w:spacing w:before="0" w:after="0"/>
         <w:ind w:left="552" w:hanging="352"/>
       </w:pPr>
@@ -4241,6 +4323,7 @@
     <w:p>
       <w:pPr>
         <w:pStyle w:val="Code"/>
+        <w:keepNext/>
         <w:spacing w:before="0" w:after="0"/>
         <w:ind w:left="552" w:hanging="352"/>
       </w:pPr>
@@ -4345,6 +4428,7 @@
     <w:p>
       <w:pPr>
         <w:pStyle w:val="Code"/>
+        <w:keepNext/>
         <w:spacing w:before="0" w:after="0"/>
         <w:ind w:left="552" w:hanging="352"/>
       </w:pPr>
@@ -4360,6 +4444,7 @@
     <w:p>
       <w:pPr>
         <w:pStyle w:val="Code"/>
+        <w:keepNext/>
         <w:spacing w:before="0" w:after="0"/>
         <w:ind w:left="552" w:hanging="352"/>
       </w:pPr>
@@ -4375,6 +4460,7 @@
     <w:p>
       <w:pPr>
         <w:pStyle w:val="Code"/>
+        <w:keepNext/>
         <w:spacing w:before="0" w:after="0"/>
         <w:ind w:left="552" w:hanging="352"/>
       </w:pPr>
@@ -4390,6 +4476,7 @@
     <w:p>
       <w:pPr>
         <w:pStyle w:val="Code"/>
+        <w:keepNext/>
         <w:spacing w:before="0" w:after="0"/>
         <w:ind w:left="552" w:hanging="352"/>
       </w:pPr>
@@ -4405,6 +4492,7 @@
     <w:p>
       <w:pPr>
         <w:pStyle w:val="Code"/>
+        <w:keepNext/>
         <w:spacing w:before="0" w:after="0"/>
         <w:ind w:left="552" w:hanging="352"/>
       </w:pPr>
@@ -4420,6 +4508,7 @@
     <w:p>
       <w:pPr>
         <w:pStyle w:val="Code"/>
+        <w:keepNext/>
         <w:spacing w:before="0" w:after="0"/>
         <w:ind w:left="552" w:hanging="352"/>
       </w:pPr>
@@ -4435,6 +4524,7 @@
     <w:p>
       <w:pPr>
         <w:pStyle w:val="Code"/>
+        <w:keepNext/>
         <w:spacing w:before="0" w:after="0"/>
         <w:ind w:left="552" w:hanging="352"/>
       </w:pPr>
@@ -4450,6 +4540,7 @@
     <w:p>
       <w:pPr>
         <w:pStyle w:val="Code"/>
+        <w:keepNext/>
         <w:spacing w:before="0" w:after="0"/>
         <w:ind w:left="552" w:hanging="352"/>
       </w:pPr>
@@ -4465,6 +4556,7 @@
     <w:p>
       <w:pPr>
         <w:pStyle w:val="Code"/>
+        <w:keepNext/>
         <w:spacing w:before="0" w:after="0"/>
         <w:ind w:left="552" w:hanging="352"/>
       </w:pPr>
@@ -4480,6 +4572,7 @@
     <w:p>
       <w:pPr>
         <w:pStyle w:val="Code"/>
+        <w:keepNext/>
         <w:spacing w:before="0" w:after="0"/>
         <w:ind w:left="552" w:hanging="352"/>
       </w:pPr>
@@ -4495,6 +4588,7 @@
     <w:p>
       <w:pPr>
         <w:pStyle w:val="Code"/>
+        <w:keepNext/>
         <w:spacing w:before="0" w:after="0"/>
         <w:ind w:left="552" w:hanging="352"/>
       </w:pPr>
@@ -4510,6 +4604,7 @@
     <w:p>
       <w:pPr>
         <w:pStyle w:val="Code"/>
+        <w:keepNext/>
         <w:spacing w:before="0" w:after="0"/>
         <w:ind w:left="552" w:hanging="352"/>
       </w:pPr>
@@ -4525,6 +4620,7 @@
     <w:p>
       <w:pPr>
         <w:pStyle w:val="Code"/>
+        <w:keepNext/>
         <w:spacing w:before="0" w:after="0"/>
         <w:ind w:left="552" w:hanging="352"/>
       </w:pPr>
@@ -4540,6 +4636,7 @@
     <w:p>
       <w:pPr>
         <w:pStyle w:val="Code"/>
+        <w:keepNext/>
         <w:spacing w:before="0" w:after="0"/>
         <w:ind w:left="552" w:hanging="352"/>
       </w:pPr>
@@ -4555,6 +4652,7 @@
     <w:p>
       <w:pPr>
         <w:pStyle w:val="Code"/>
+        <w:keepNext/>
         <w:spacing w:before="0" w:after="0"/>
         <w:ind w:left="552" w:hanging="352"/>
       </w:pPr>
@@ -4570,6 +4668,7 @@
     <w:p>
       <w:pPr>
         <w:pStyle w:val="Code"/>
+        <w:keepNext/>
         <w:spacing w:before="0" w:after="0"/>
         <w:ind w:left="552" w:hanging="352"/>
       </w:pPr>
@@ -4585,6 +4684,7 @@
     <w:p>
       <w:pPr>
         <w:pStyle w:val="Code"/>
+        <w:keepNext/>
         <w:spacing w:before="0" w:after="0"/>
         <w:ind w:left="552" w:hanging="352"/>
       </w:pPr>
@@ -4600,6 +4700,7 @@
     <w:p>
       <w:pPr>
         <w:pStyle w:val="Code"/>
+        <w:keepNext/>
         <w:spacing w:before="0" w:after="0"/>
         <w:ind w:left="552" w:hanging="352"/>
       </w:pPr>
@@ -4615,6 +4716,7 @@
     <w:p>
       <w:pPr>
         <w:pStyle w:val="Code"/>
+        <w:keepNext/>
         <w:spacing w:before="0" w:after="0"/>
         <w:ind w:left="552" w:hanging="352"/>
       </w:pPr>
@@ -4630,6 +4732,7 @@
     <w:p>
       <w:pPr>
         <w:pStyle w:val="Code"/>
+        <w:keepNext/>
         <w:spacing w:before="0" w:after="0"/>
         <w:ind w:left="552" w:hanging="352"/>
       </w:pPr>
@@ -4645,6 +4748,7 @@
     <w:p>
       <w:pPr>
         <w:pStyle w:val="Code"/>
+        <w:keepNext/>
         <w:spacing w:before="0" w:after="0"/>
         <w:ind w:left="552" w:hanging="352"/>
       </w:pPr>
@@ -4660,6 +4764,7 @@
     <w:p>
       <w:pPr>
         <w:pStyle w:val="Code"/>
+        <w:keepNext/>
         <w:spacing w:before="0" w:after="0"/>
         <w:ind w:left="552" w:hanging="352"/>
       </w:pPr>
@@ -4675,6 +4780,7 @@
     <w:p>
       <w:pPr>
         <w:pStyle w:val="Code"/>
+        <w:keepNext/>
         <w:spacing w:before="0" w:after="0"/>
         <w:ind w:left="552" w:hanging="352"/>
       </w:pPr>
@@ -4690,6 +4796,7 @@
     <w:p>
       <w:pPr>
         <w:pStyle w:val="Code"/>
+        <w:keepNext/>
         <w:spacing w:before="0" w:after="0"/>
         <w:ind w:left="552" w:hanging="352"/>
       </w:pPr>
@@ -4705,6 +4812,7 @@
     <w:p>
       <w:pPr>
         <w:pStyle w:val="Code"/>
+        <w:keepNext/>
         <w:spacing w:before="0" w:after="0"/>
         <w:ind w:left="552" w:hanging="352"/>
       </w:pPr>
@@ -4720,6 +4828,7 @@
     <w:p>
       <w:pPr>
         <w:pStyle w:val="Code"/>
+        <w:keepNext/>
         <w:spacing w:before="0" w:after="0"/>
         <w:ind w:left="552" w:hanging="352"/>
       </w:pPr>
@@ -4735,6 +4844,7 @@
     <w:p>
       <w:pPr>
         <w:pStyle w:val="Code"/>
+        <w:keepNext/>
         <w:spacing w:before="0" w:after="0"/>
         <w:ind w:left="552" w:hanging="352"/>
       </w:pPr>
@@ -4750,6 +4860,7 @@
     <w:p>
       <w:pPr>
         <w:pStyle w:val="Code"/>
+        <w:keepNext/>
         <w:spacing w:before="0" w:after="0"/>
         <w:ind w:left="552" w:hanging="352"/>
       </w:pPr>
@@ -4765,6 +4876,7 @@
     <w:p>
       <w:pPr>
         <w:pStyle w:val="Code"/>
+        <w:keepNext/>
         <w:spacing w:before="0" w:after="0"/>
         <w:ind w:left="552" w:hanging="352"/>
       </w:pPr>
@@ -4869,6 +4981,7 @@
     <w:p>
       <w:pPr>
         <w:pStyle w:val="Code"/>
+        <w:keepNext/>
         <w:spacing w:before="0" w:after="0"/>
         <w:ind w:left="552" w:hanging="352"/>
       </w:pPr>
@@ -4884,6 +4997,7 @@
     <w:p>
       <w:pPr>
         <w:pStyle w:val="Code"/>
+        <w:keepNext/>
         <w:spacing w:before="0" w:after="0"/>
         <w:ind w:left="552" w:hanging="352"/>
       </w:pPr>
@@ -4899,6 +5013,7 @@
     <w:p>
       <w:pPr>
         <w:pStyle w:val="Code"/>
+        <w:keepNext/>
         <w:spacing w:before="0" w:after="0"/>
         <w:ind w:left="552" w:hanging="352"/>
       </w:pPr>
@@ -4914,6 +5029,7 @@
     <w:p>
       <w:pPr>
         <w:pStyle w:val="Code"/>
+        <w:keepNext/>
         <w:spacing w:before="0" w:after="0"/>
         <w:ind w:left="552" w:hanging="352"/>
       </w:pPr>
@@ -4929,6 +5045,7 @@
     <w:p>
       <w:pPr>
         <w:pStyle w:val="Code"/>
+        <w:keepNext/>
         <w:spacing w:before="0" w:after="0"/>
         <w:ind w:left="552" w:hanging="352"/>
       </w:pPr>
@@ -4944,6 +5061,7 @@
     <w:p>
       <w:pPr>
         <w:pStyle w:val="Code"/>
+        <w:keepNext/>
         <w:spacing w:before="0" w:after="0"/>
         <w:ind w:left="552" w:hanging="352"/>
       </w:pPr>
@@ -4959,6 +5077,7 @@
     <w:p>
       <w:pPr>
         <w:pStyle w:val="Code"/>
+        <w:keepNext/>
         <w:spacing w:before="0" w:after="0"/>
         <w:ind w:left="552" w:hanging="352"/>
       </w:pPr>
@@ -4974,6 +5093,7 @@
     <w:p>
       <w:pPr>
         <w:pStyle w:val="Code"/>
+        <w:keepNext/>
         <w:spacing w:before="0" w:after="0"/>
         <w:ind w:left="552" w:hanging="352"/>
       </w:pPr>
@@ -4989,6 +5109,7 @@
     <w:p>
       <w:pPr>
         <w:pStyle w:val="Code"/>
+        <w:keepNext/>
         <w:spacing w:before="0" w:after="0"/>
         <w:ind w:left="552" w:hanging="352"/>
       </w:pPr>
@@ -5004,6 +5125,7 @@
     <w:p>
       <w:pPr>
         <w:pStyle w:val="Code"/>
+        <w:keepNext/>
         <w:spacing w:before="0" w:after="0"/>
         <w:ind w:left="552" w:hanging="352"/>
       </w:pPr>
@@ -5019,6 +5141,7 @@
     <w:p>
       <w:pPr>
         <w:pStyle w:val="Code"/>
+        <w:keepNext/>
         <w:spacing w:before="0" w:after="0"/>
         <w:ind w:left="552" w:hanging="352"/>
       </w:pPr>
@@ -5034,6 +5157,7 @@
     <w:p>
       <w:pPr>
         <w:pStyle w:val="Code"/>
+        <w:keepNext/>
         <w:spacing w:before="0" w:after="0"/>
         <w:ind w:left="552" w:hanging="352"/>
       </w:pPr>
@@ -5049,6 +5173,7 @@
     <w:p>
       <w:pPr>
         <w:pStyle w:val="Code"/>
+        <w:keepNext/>
         <w:spacing w:before="0" w:after="0"/>
         <w:ind w:left="552" w:hanging="352"/>
       </w:pPr>
@@ -5064,6 +5189,7 @@
     <w:p>
       <w:pPr>
         <w:pStyle w:val="Code"/>
+        <w:keepNext/>
         <w:spacing w:before="0" w:after="0"/>
         <w:ind w:left="552" w:hanging="352"/>
       </w:pPr>
@@ -5079,6 +5205,7 @@
     <w:p>
       <w:pPr>
         <w:pStyle w:val="Code"/>
+        <w:keepNext/>
         <w:spacing w:before="0" w:after="0"/>
         <w:ind w:left="552" w:hanging="352"/>
       </w:pPr>
@@ -5094,6 +5221,7 @@
     <w:p>
       <w:pPr>
         <w:pStyle w:val="Code"/>
+        <w:keepNext/>
         <w:spacing w:before="0" w:after="0"/>
         <w:ind w:left="552" w:hanging="352"/>
       </w:pPr>
@@ -5109,6 +5237,7 @@
     <w:p>
       <w:pPr>
         <w:pStyle w:val="Code"/>
+        <w:keepNext/>
         <w:spacing w:before="0" w:after="0"/>
         <w:ind w:left="552" w:hanging="352"/>
       </w:pPr>
@@ -5124,6 +5253,7 @@
     <w:p>
       <w:pPr>
         <w:pStyle w:val="Code"/>
+        <w:keepNext/>
         <w:spacing w:before="0" w:after="0"/>
         <w:ind w:left="552" w:hanging="352"/>
       </w:pPr>
@@ -5139,6 +5269,7 @@
     <w:p>
       <w:pPr>
         <w:pStyle w:val="Code"/>
+        <w:keepNext/>
         <w:spacing w:before="0" w:after="0"/>
         <w:ind w:left="552" w:hanging="352"/>
       </w:pPr>
@@ -5154,6 +5285,7 @@
     <w:p>
       <w:pPr>
         <w:pStyle w:val="Code"/>
+        <w:keepNext/>
         <w:spacing w:before="0" w:after="0"/>
         <w:ind w:left="552" w:hanging="352"/>
       </w:pPr>
@@ -5169,6 +5301,7 @@
     <w:p>
       <w:pPr>
         <w:pStyle w:val="Code"/>
+        <w:keepNext/>
         <w:spacing w:before="0" w:after="0"/>
         <w:ind w:left="552" w:hanging="352"/>
       </w:pPr>
@@ -5184,6 +5317,7 @@
     <w:p>
       <w:pPr>
         <w:pStyle w:val="Code"/>
+        <w:keepNext/>
         <w:spacing w:before="0" w:after="0"/>
         <w:ind w:left="552" w:hanging="352"/>
       </w:pPr>
@@ -5199,6 +5333,7 @@
     <w:p>
       <w:pPr>
         <w:pStyle w:val="Code"/>
+        <w:keepNext/>
         <w:spacing w:before="0" w:after="0"/>
         <w:ind w:left="552" w:hanging="352"/>
       </w:pPr>
@@ -5214,6 +5349,7 @@
     <w:p>
       <w:pPr>
         <w:pStyle w:val="Code"/>
+        <w:keepNext/>
         <w:spacing w:before="0" w:after="0"/>
         <w:ind w:left="552" w:hanging="352"/>
       </w:pPr>
@@ -5252,6 +5388,7 @@
     <w:p>
       <w:pPr>
         <w:pStyle w:val="Code"/>
+        <w:keepNext/>
         <w:spacing w:before="0" w:after="0"/>
         <w:ind w:left="552" w:hanging="352"/>
       </w:pPr>
@@ -5267,6 +5404,7 @@
     <w:p>
       <w:pPr>
         <w:pStyle w:val="Code"/>
+        <w:keepNext/>
         <w:spacing w:before="0" w:after="0"/>
         <w:ind w:left="552" w:hanging="352"/>
       </w:pPr>
@@ -5282,6 +5420,7 @@
     <w:p>
       <w:pPr>
         <w:pStyle w:val="Code"/>
+        <w:keepNext/>
         <w:spacing w:before="0" w:after="0"/>
         <w:ind w:left="552" w:hanging="352"/>
       </w:pPr>
@@ -5297,6 +5436,7 @@
     <w:p>
       <w:pPr>
         <w:pStyle w:val="Code"/>
+        <w:keepNext/>
         <w:spacing w:before="0" w:after="0"/>
         <w:ind w:left="552" w:hanging="352"/>
       </w:pPr>
@@ -5312,6 +5452,7 @@
     <w:p>
       <w:pPr>
         <w:pStyle w:val="Code"/>
+        <w:keepNext/>
         <w:spacing w:before="0" w:after="0"/>
         <w:ind w:left="552" w:hanging="352"/>
       </w:pPr>
@@ -5327,6 +5468,7 @@
     <w:p>
       <w:pPr>
         <w:pStyle w:val="Code"/>
+        <w:keepNext/>
         <w:spacing w:before="0" w:after="0"/>
         <w:ind w:left="552" w:hanging="352"/>
       </w:pPr>
@@ -5342,6 +5484,7 @@
     <w:p>
       <w:pPr>
         <w:pStyle w:val="Code"/>
+        <w:keepNext/>
         <w:spacing w:before="0" w:after="0"/>
         <w:ind w:left="552" w:hanging="352"/>
       </w:pPr>
@@ -5357,6 +5500,7 @@
     <w:p>
       <w:pPr>
         <w:pStyle w:val="Code"/>
+        <w:keepNext/>
         <w:spacing w:before="0" w:after="0"/>
         <w:ind w:left="552" w:hanging="352"/>
       </w:pPr>
@@ -5372,6 +5516,7 @@
     <w:p>
       <w:pPr>
         <w:pStyle w:val="Code"/>
+        <w:keepNext/>
         <w:spacing w:before="0" w:after="0"/>
         <w:ind w:left="552" w:hanging="352"/>
       </w:pPr>
@@ -5387,6 +5532,7 @@
     <w:p>
       <w:pPr>
         <w:pStyle w:val="Code"/>
+        <w:keepNext/>
         <w:spacing w:before="0" w:after="0"/>
         <w:ind w:left="552" w:hanging="352"/>
       </w:pPr>
@@ -5402,6 +5548,7 @@
     <w:p>
       <w:pPr>
         <w:pStyle w:val="Code"/>
+        <w:keepNext/>
         <w:spacing w:before="0" w:after="0"/>
         <w:ind w:left="552" w:hanging="352"/>
       </w:pPr>
@@ -5519,7 +5666,7 @@
         <w:keepNext/>
       </w:pPr>
       <w:r>
-        <w:t xml:space="preserve">11.4 Screenshots from VS Code</w:t>
+        <w:t xml:space="preserve">11.4 Screenshots from VS Code (optional)</w:t>
       </w:r>
     </w:p>
     <w:tbl>
@@ -5556,7 +5703,7 @@
                 <w:i/>
                 <w:color w:val="5B6478"/>
               </w:rPr>
-              <w:t xml:space="preserve">Screenshot placeholder: VS Code – studenthub/index.php, lines 18–65</w:t>
+              <w:t xml:space="preserve">OPTIONAL – VS Code screenshot: studenthub/index.php, lines 18–65</w:t>
             </w:r>
           </w:p>
           <w:p>
@@ -5571,7 +5718,7 @@
                 <w:sz w:val="19"/>
                 <w:szCs w:val="19"/>
               </w:rPr>
-              <w:t xml:space="preserve">Insert a screenshot of the file open in VS Code.</w:t>
+              <w:t xml:space="preserve">Not required for Practical 1. Insert a genuine screenshot of the file open in VS Code, or delete this box.</w:t>
             </w:r>
           </w:p>
         </w:tc>
@@ -5619,7 +5766,7 @@
                 <w:i/>
                 <w:color w:val="5B6478"/>
               </w:rPr>
-              <w:t xml:space="preserve">Screenshot placeholder: VS Code – studenthub/sidebar.php, lines 8–32</w:t>
+              <w:t xml:space="preserve">OPTIONAL – VS Code screenshot: studenthub/sidebar.php, lines 8–32</w:t>
             </w:r>
           </w:p>
           <w:p>
@@ -5634,7 +5781,7 @@
                 <w:sz w:val="19"/>
                 <w:szCs w:val="19"/>
               </w:rPr>
-              <w:t xml:space="preserve">Insert a screenshot of the file open in VS Code.</w:t>
+              <w:t xml:space="preserve">Not required for Practical 1. Insert a genuine screenshot of the file open in VS Code, or delete this box.</w:t>
             </w:r>
           </w:p>
         </w:tc>
@@ -5717,7 +5864,7 @@
                 <w:i/>
                 <w:color w:val="5B6478"/>
               </w:rPr>
-              <w:t xml:space="preserve">PLACEHOLDER – GitHub repository screenshot (genuine screenshot required)</w:t>
+              <w:t xml:space="preserve">PLACEHOLDER – GitHub repository screenshot (genuine screenshot required, not yet inserted)</w:t>
             </w:r>
           </w:p>
           <w:p>
@@ -5732,7 +5879,7 @@
                 <w:sz w:val="19"/>
                 <w:szCs w:val="19"/>
               </w:rPr>
-              <w:t xml:space="preserve">Insert a screenshot of the repository page showing the uploaded project; save the same image as Practical-1/screenshots/github-repository.png.</w:t>
+              <w:t xml:space="preserve">Insert a screenshot of the repository home page https://github.com/TheEmperor08/StudentHub-ITUE203-25CS023 showing the repository name, file list and README. A screenshot of a single folder is not sufficient. Save the same image as Practical-1/screenshots/github-repository.png.</w:t>
             </w:r>
           </w:p>
         </w:tc>
@@ -5790,6 +5937,7 @@
           </w:tcPr>
           <w:p>
             <w:pPr>
+              <w:keepNext/>
               <w:spacing w:before="0" w:after="0"/>
               <w:jc w:val="left"/>
             </w:pPr>
@@ -5811,6 +5959,7 @@
           </w:tcPr>
           <w:p>
             <w:pPr>
+              <w:keepNext/>
               <w:spacing w:before="0" w:after="0"/>
               <w:jc w:val="left"/>
             </w:pPr>
@@ -5836,6 +5985,7 @@
           </w:tcPr>
           <w:p>
             <w:pPr>
+              <w:keepNext/>
               <w:spacing w:before="0" w:after="0"/>
               <w:jc w:val="left"/>
             </w:pPr>
@@ -5854,6 +6004,7 @@
           </w:tcPr>
           <w:p>
             <w:pPr>
+              <w:keepNext/>
               <w:spacing w:before="0" w:after="0"/>
               <w:jc w:val="left"/>
             </w:pPr>
@@ -5877,6 +6028,7 @@
           </w:tcPr>
           <w:p>
             <w:pPr>
+              <w:keepNext/>
               <w:spacing w:before="0" w:after="0"/>
               <w:jc w:val="left"/>
             </w:pPr>
@@ -5895,15 +6047,16 @@
           </w:tcPr>
           <w:p>
             <w:pPr>
-              <w:spacing w:before="0" w:after="0"/>
-              <w:jc w:val="left"/>
-            </w:pPr>
-            <w:r>
-              <w:rPr>
-                <w:sz w:val="20"/>
-                <w:szCs w:val="20"/>
-              </w:rPr>
-              <w:t xml:space="preserve">PHP 8.2</w:t>
+              <w:keepNext/>
+              <w:spacing w:before="0" w:after="0"/>
+              <w:jc w:val="left"/>
+            </w:pPr>
+            <w:r>
+              <w:rPr>
+                <w:sz w:val="20"/>
+                <w:szCs w:val="20"/>
+              </w:rPr>
+              <w:t xml:space="preserve">PHP 8.2 (8.2.12, bundled with XAMPP)</w:t>
             </w:r>
           </w:p>
         </w:tc>
@@ -5918,6 +6071,7 @@
           </w:tcPr>
           <w:p>
             <w:pPr>
+              <w:keepNext/>
               <w:spacing w:before="0" w:after="0"/>
               <w:jc w:val="left"/>
             </w:pPr>
@@ -5936,15 +6090,16 @@
           </w:tcPr>
           <w:p>
             <w:pPr>
-              <w:spacing w:before="0" w:after="0"/>
-              <w:jc w:val="left"/>
-            </w:pPr>
-            <w:r>
-              <w:rPr>
-                <w:sz w:val="20"/>
-                <w:szCs w:val="20"/>
-              </w:rPr>
-              <w:t xml:space="preserve">MySQL / MariaDB</w:t>
+              <w:keepNext/>
+              <w:spacing w:before="0" w:after="0"/>
+              <w:jc w:val="left"/>
+            </w:pPr>
+            <w:r>
+              <w:rPr>
+                <w:sz w:val="20"/>
+                <w:szCs w:val="20"/>
+              </w:rPr>
+              <w:t xml:space="preserve">MariaDB 10.4 (MySQL-compatible, bundled with XAMPP)</w:t>
             </w:r>
           </w:p>
         </w:tc>
@@ -5959,6 +6114,7 @@
           </w:tcPr>
           <w:p>
             <w:pPr>
+              <w:keepNext/>
               <w:spacing w:before="0" w:after="0"/>
               <w:jc w:val="left"/>
             </w:pPr>
@@ -5977,15 +6133,16 @@
           </w:tcPr>
           <w:p>
             <w:pPr>
-              <w:spacing w:before="0" w:after="0"/>
-              <w:jc w:val="left"/>
-            </w:pPr>
-            <w:r>
-              <w:rPr>
-                <w:sz w:val="20"/>
-                <w:szCs w:val="20"/>
-              </w:rPr>
-              <w:t xml:space="preserve">XAMPP / PHP built-in server (php -S)</w:t>
+              <w:keepNext/>
+              <w:spacing w:before="0" w:after="0"/>
+              <w:jc w:val="left"/>
+            </w:pPr>
+            <w:r>
+              <w:rPr>
+                <w:sz w:val="20"/>
+                <w:szCs w:val="20"/>
+              </w:rPr>
+              <w:t xml:space="preserve">XAMPP; PHP built-in server (php -S) for local testing</w:t>
             </w:r>
           </w:p>
         </w:tc>
@@ -6000,6 +6157,7 @@
           </w:tcPr>
           <w:p>
             <w:pPr>
+              <w:keepNext/>
               <w:spacing w:before="0" w:after="0"/>
               <w:jc w:val="left"/>
             </w:pPr>
@@ -6018,15 +6176,16 @@
           </w:tcPr>
           <w:p>
             <w:pPr>
-              <w:spacing w:before="0" w:after="0"/>
-              <w:jc w:val="left"/>
-            </w:pPr>
-            <w:r>
-              <w:rPr>
-                <w:sz w:val="20"/>
-                <w:szCs w:val="20"/>
-              </w:rPr>
-              <w:t xml:space="preserve">Python script generating SVG and PNG (Practical-1/source/build_diagrams.py)</w:t>
+              <w:keepNext/>
+              <w:spacing w:before="0" w:after="0"/>
+              <w:jc w:val="left"/>
+            </w:pPr>
+            <w:r>
+              <w:rPr>
+                <w:sz w:val="20"/>
+                <w:szCs w:val="20"/>
+              </w:rPr>
+              <w:t xml:space="preserve">Python scripts in Practical-1/source/: build_diagrams.py (SVG and PNG), export_pdfs.py (PDF)</w:t>
             </w:r>
           </w:p>
         </w:tc>
@@ -6132,6 +6291,7 @@
           </w:tcPr>
           <w:p>
             <w:pPr>
+              <w:keepNext/>
               <w:spacing w:before="0" w:after="0"/>
               <w:jc w:val="left"/>
             </w:pPr>
@@ -6153,6 +6313,7 @@
           </w:tcPr>
           <w:p>
             <w:pPr>
+              <w:keepNext/>
               <w:spacing w:before="0" w:after="0"/>
               <w:jc w:val="left"/>
             </w:pPr>
@@ -6174,6 +6335,7 @@
           </w:tcPr>
           <w:p>
             <w:pPr>
+              <w:keepNext/>
               <w:spacing w:before="0" w:after="0"/>
               <w:jc w:val="left"/>
             </w:pPr>
@@ -6199,6 +6361,7 @@
           </w:tcPr>
           <w:p>
             <w:pPr>
+              <w:keepNext/>
               <w:spacing w:before="0" w:after="0"/>
               <w:jc w:val="left"/>
             </w:pPr>
@@ -6217,6 +6380,7 @@
           </w:tcPr>
           <w:p>
             <w:pPr>
+              <w:keepNext/>
               <w:spacing w:before="0" w:after="0"/>
               <w:jc w:val="left"/>
             </w:pPr>
@@ -6235,6 +6399,7 @@
           </w:tcPr>
           <w:p>
             <w:pPr>
+              <w:keepNext/>
               <w:spacing w:before="0" w:after="0"/>
               <w:jc w:val="left"/>
             </w:pPr>
@@ -6258,6 +6423,7 @@
           </w:tcPr>
           <w:p>
             <w:pPr>
+              <w:keepNext/>
               <w:spacing w:before="0" w:after="0"/>
               <w:jc w:val="left"/>
             </w:pPr>
@@ -6276,6 +6442,7 @@
           </w:tcPr>
           <w:p>
             <w:pPr>
+              <w:keepNext/>
               <w:spacing w:before="0" w:after="0"/>
               <w:jc w:val="left"/>
             </w:pPr>
@@ -6294,28 +6461,30 @@
           </w:tcPr>
           <w:p>
             <w:pPr>
-              <w:spacing w:before="0" w:after="0"/>
-              <w:jc w:val="left"/>
-            </w:pPr>
-            <w:r>
-              <w:rPr>
-                <w:sz w:val="20"/>
-                <w:szCs w:val="20"/>
-              </w:rPr>
-              <w:t xml:space="preserve">Section 12 of this report</w:t>
-            </w:r>
-          </w:p>
-          <w:p>
-            <w:pPr>
-              <w:spacing w:before="0" w:after="0"/>
-              <w:jc w:val="left"/>
-            </w:pPr>
-            <w:r>
-              <w:rPr>
-                <w:sz w:val="20"/>
-                <w:szCs w:val="20"/>
-              </w:rPr>
-              <w:t xml:space="preserve">Practical-1/screenshots/github-repository.png</w:t>
+              <w:keepNext/>
+              <w:spacing w:before="0" w:after="0"/>
+              <w:jc w:val="left"/>
+            </w:pPr>
+            <w:r>
+              <w:rPr>
+                <w:sz w:val="20"/>
+                <w:szCs w:val="20"/>
+              </w:rPr>
+              <w:t xml:space="preserve">Pending – placeholder in Section 12</w:t>
+            </w:r>
+          </w:p>
+          <w:p>
+            <w:pPr>
+              <w:keepNext/>
+              <w:spacing w:before="0" w:after="0"/>
+              <w:jc w:val="left"/>
+            </w:pPr>
+            <w:r>
+              <w:rPr>
+                <w:sz w:val="20"/>
+                <w:szCs w:val="20"/>
+              </w:rPr>
+              <w:t xml:space="preserve">Genuine screenshot to be inserted and saved as Practical-1/screenshots/github-repository.png</w:t>
             </w:r>
           </w:p>
         </w:tc>
@@ -6330,6 +6499,7 @@
           </w:tcPr>
           <w:p>
             <w:pPr>
+              <w:keepNext/>
               <w:spacing w:before="0" w:after="0"/>
               <w:jc w:val="left"/>
             </w:pPr>
@@ -6348,6 +6518,7 @@
           </w:tcPr>
           <w:p>
             <w:pPr>
+              <w:keepNext/>
               <w:spacing w:before="0" w:after="0"/>
               <w:jc w:val="left"/>
             </w:pPr>
@@ -6366,6 +6537,7 @@
           </w:tcPr>
           <w:p>
             <w:pPr>
+              <w:keepNext/>
               <w:spacing w:before="0" w:after="0"/>
               <w:jc w:val="left"/>
             </w:pPr>
@@ -6389,6 +6561,7 @@
           </w:tcPr>
           <w:p>
             <w:pPr>
+              <w:keepNext/>
               <w:spacing w:before="0" w:after="0"/>
               <w:jc w:val="left"/>
             </w:pPr>
@@ -6407,6 +6580,7 @@
           </w:tcPr>
           <w:p>
             <w:pPr>
+              <w:keepNext/>
               <w:spacing w:before="0" w:after="0"/>
               <w:jc w:val="left"/>
             </w:pPr>
@@ -6425,6 +6599,7 @@
           </w:tcPr>
           <w:p>
             <w:pPr>
+              <w:keepNext/>
               <w:spacing w:before="0" w:after="0"/>
               <w:jc w:val="left"/>
             </w:pPr>
@@ -6438,6 +6613,7 @@
           </w:p>
           <w:p>
             <w:pPr>
+              <w:keepNext/>
               <w:spacing w:before="0" w:after="0"/>
               <w:jc w:val="left"/>
             </w:pPr>
@@ -6530,6 +6706,12 @@
       </w:pPr>
       <w:r>
         <w:t xml:space="preserve"/>
+      </w:r>
+    </w:p>
+    <w:p>
+      <w:pPr/>
+      <w:r>
+        <w:t xml:space="preserve">This report is provided as PRAC_1_ITUE203_25CS023.docx, with a PDF copy PRAC_1_ITUE203_25CS023.pdf in the same folder.</w:t>
       </w:r>
     </w:p>
     <w:p>

</xml_diff>